<commit_message>
Fix 4 incomplete past paper answers across PastPaper and FullNotes docs
- Dec 2024 Q4: Add full 10-step A* expansion table (Timisoara→Bucharest, cost=536)
- Dec 2024 Q6: Add complete Decision Tree with IG table (IG: Study Years=0.0, Hours=0.75, Attendance=0.189; tree rooted at Study Hours)
- May 2025 Q19c: Add full 6-mark CNN crowd counting answer (spatial locality, translation invariance, density map + MCNN/dilated/attention)
- Dec 2023 Q4: Add full 2-iteration K-Means distance table (converges to C1={0.12,0.15,0.21}, C2={0.50..0.89}, C3={1.25..1.97})

Co-Authored-By: Claude Sonnet 4.6 <noreply@anthropic.com>
</commit_message>
<xml_diff>
--- a/COMP4431_PastPaper_QuizSol.docx
+++ b/COMP4431_PastPaper_QuizSol.docx
@@ -5621,21 +5621,10 @@
     </w:p>
     <w:p>
       <w:pPr>
-        <w:pStyle w:val="Heading2"/>
+        <w:pStyle w:val="Heading3"/>
       </w:pPr>
       <w:r>
-        <w:rPr>
-          <w:color w:val="2E74B5"/>
-        </w:rPr>
-        <w:t>PAPER 2 — Dec 2024 / Sem I (20250328_2_20.pdf)</w:t>
-      </w:r>
-    </w:p>
-    <w:p>
-      <w:pPr>
-        <w:pStyle w:val="Heading3"/>
-      </w:pPr>
-      <w:r>
-        <w:t>Q3 — Short Paragraph Concept Answers</w:t>
+        <w:t>Q19c — CNN for Crowd Counting: Do You Agree? [6 marks]</w:t>
       </w:r>
     </w:p>
     <w:p>
@@ -5648,7 +5637,7 @@
           <w:b w:val="0"/>
           <w:sz w:val="20"/>
         </w:rPr>
-        <w:t>Q3.1 Discriminative vs Generative: see Section 2.</w:t>
+        <w:t>YES — CNN is well-suited for crowd counting. Three key reasons:</w:t>
       </w:r>
     </w:p>
     <w:p>
@@ -5661,7 +5650,7 @@
           <w:b w:val="0"/>
           <w:sz w:val="20"/>
         </w:rPr>
-        <w:t>Q3.2 Classification vs Clustering: see Section 2.</w:t>
+        <w:t>1. SPATIAL LOCALITY: Convolutional filters detect local patterns (heads, bodies) at every spatial position via weight sharing — critical when crowd density varies across the image.</w:t>
       </w:r>
     </w:p>
     <w:p>
@@ -5674,7 +5663,7 @@
           <w:b w:val="0"/>
           <w:sz w:val="20"/>
         </w:rPr>
-        <w:t>Q3.3 MCV vs LCV: see Section 2.</w:t>
+        <w:t>2. TRANSLATION INVARIANCE: Pooling layers make detection robust to slight shifts in position. A head at top-left and one at bottom-right produce the same filter response.</w:t>
       </w:r>
     </w:p>
     <w:p>
@@ -5687,20 +5676,7 @@
           <w:b w:val="0"/>
           <w:sz w:val="20"/>
         </w:rPr>
-        <w:t>Q3.4 Forward vs Backward Chaining: see Section 2.</w:t>
-      </w:r>
-    </w:p>
-    <w:p>
-      <w:pPr>
-        <w:spacing w:after="0"/>
-      </w:pPr>
-    </w:p>
-    <w:p>
-      <w:pPr>
-        <w:pStyle w:val="Heading3"/>
-      </w:pPr>
-      <w:r>
-        <w:t>Q4 — A* Timisoara to Bucharest (Romania map)</w:t>
+        <w:t>3. DENSITY MAP OUTPUT: CNNs can be trained end-to-end to produce a density map (value per pixel region) rather than a single integer count, enabling spatial localisation of crowd hotspots.</w:t>
       </w:r>
     </w:p>
     <w:p>
@@ -5713,25 +5689,7 @@
           <w:b w:val="0"/>
           <w:sz w:val="20"/>
         </w:rPr>
-        <w:t>Heuristics = straight-line distances to Bucharest. Show f=g+h at every step.</w:t>
-      </w:r>
-    </w:p>
-    <w:p>
-      <w:pPr>
-        <w:ind w:left="320"/>
-      </w:pPr>
-      <w:r>
-        <w:rPr>
-          <w:b/>
-          <w:sz w:val="20"/>
-        </w:rPr>
-        <w:t xml:space="preserve">ANSWER: </w:t>
-      </w:r>
-      <w:r>
-        <w:rPr>
-          <w:sz w:val="20"/>
-        </w:rPr>
-        <w:t>Optimal path: Timisoara → Arad → Sibiu → Rimnicu → Pitesti → Bucharest, cost = 536 km</w:t>
+        <w:t>Enhancement techniques: (a) Multi-column CNN (MCNN) — parallel branches with different kernel sizes handle scale variation as people appear larger/smaller at different distances. (b) Dilated convolutions increase receptive field without losing resolution. (c) Attention mechanisms focus on head/body regions and suppress background noise.</w:t>
       </w:r>
     </w:p>
     <w:p>
@@ -5752,7 +5710,1073 @@
           <w:color w:val="C05500"/>
           <w:sz w:val="20"/>
         </w:rPr>
-        <w:t>Always expand node with LOWEST f(n). When expanding, list ALL frontier nodes with their f values.</w:t>
+        <w:t>6-mark rubric: ~2 marks per well-explained CNN property + 1 enhancement/limitation. Name the property AND explain why it helps counting.</w:t>
+      </w:r>
+    </w:p>
+    <w:p>
+      <w:pPr>
+        <w:spacing w:after="0"/>
+      </w:pPr>
+    </w:p>
+    <w:p>
+      <w:pPr>
+        <w:pStyle w:val="Heading2"/>
+      </w:pPr>
+      <w:r>
+        <w:rPr>
+          <w:color w:val="2E74B5"/>
+        </w:rPr>
+        <w:t>PAPER 2 — Dec 2024 / Sem I (20250328_2_20.pdf)</w:t>
+      </w:r>
+    </w:p>
+    <w:p>
+      <w:pPr>
+        <w:pStyle w:val="Heading3"/>
+      </w:pPr>
+      <w:r>
+        <w:t>Q3 — Short Paragraph Concept Answers</w:t>
+      </w:r>
+    </w:p>
+    <w:p>
+      <w:pPr>
+        <w:spacing w:after="40"/>
+        <w:ind w:left="240"/>
+      </w:pPr>
+      <w:r>
+        <w:rPr>
+          <w:b w:val="0"/>
+          <w:sz w:val="20"/>
+        </w:rPr>
+        <w:t>Q3.1 Discriminative vs Generative: see Section 2.</w:t>
+      </w:r>
+    </w:p>
+    <w:p>
+      <w:pPr>
+        <w:spacing w:after="40"/>
+        <w:ind w:left="240"/>
+      </w:pPr>
+      <w:r>
+        <w:rPr>
+          <w:b w:val="0"/>
+          <w:sz w:val="20"/>
+        </w:rPr>
+        <w:t>Q3.2 Classification vs Clustering: see Section 2.</w:t>
+      </w:r>
+    </w:p>
+    <w:p>
+      <w:pPr>
+        <w:spacing w:after="40"/>
+        <w:ind w:left="240"/>
+      </w:pPr>
+      <w:r>
+        <w:rPr>
+          <w:b w:val="0"/>
+          <w:sz w:val="20"/>
+        </w:rPr>
+        <w:t>Q3.3 MCV vs LCV: see Section 2.</w:t>
+      </w:r>
+    </w:p>
+    <w:p>
+      <w:pPr>
+        <w:spacing w:after="40"/>
+        <w:ind w:left="240"/>
+      </w:pPr>
+      <w:r>
+        <w:rPr>
+          <w:b w:val="0"/>
+          <w:sz w:val="20"/>
+        </w:rPr>
+        <w:t>Q3.4 Forward vs Backward Chaining: see Section 2.</w:t>
+      </w:r>
+    </w:p>
+    <w:p>
+      <w:pPr>
+        <w:spacing w:after="0"/>
+      </w:pPr>
+    </w:p>
+    <w:p>
+      <w:pPr>
+        <w:pStyle w:val="Heading3"/>
+      </w:pPr>
+      <w:r>
+        <w:t>Q4 — A* Timisoara to Bucharest (Romania map) [12 marks]</w:t>
+      </w:r>
+    </w:p>
+    <w:p>
+      <w:pPr>
+        <w:spacing w:after="40"/>
+        <w:ind w:left="240"/>
+      </w:pPr>
+      <w:r>
+        <w:rPr>
+          <w:b w:val="0"/>
+          <w:sz w:val="20"/>
+        </w:rPr>
+        <w:t>SLD heuristics: Timisoara=329, Lugoj=244, Arad=366, Mehadia=241, Dobreta=242, Sibiu=253, RimnicuVilcea=193, Fagaras=176, Pitesti=100, Bucharest=0</w:t>
+      </w:r>
+    </w:p>
+    <w:p>
+      <w:pPr>
+        <w:spacing w:after="40"/>
+        <w:ind w:left="240"/>
+      </w:pPr>
+      <w:r>
+        <w:rPr>
+          <w:b w:val="0"/>
+          <w:sz w:val="20"/>
+        </w:rPr>
+        <w:t>Edge costs: Tim-Arad=118, Tim-Lugoj=111, Lugoj-Mehadia=70, Mehadia-Dobreta=75, Dobreta-Craiova=120, Arad-Sibiu=140, Sibiu-RV=80, Sibiu-Fagaras=99, RV-Pitesti=97, Pitesti-Bucharest=101</w:t>
+      </w:r>
+    </w:p>
+    <w:tbl>
+      <w:tblPr>
+        <w:tblStyle w:val="TableGrid"/>
+        <w:tblW w:type="auto" w:w="0"/>
+        <w:tblLook w:firstColumn="1" w:firstRow="1" w:lastColumn="0" w:lastRow="0" w:noHBand="0" w:noVBand="1" w:val="04A0"/>
+      </w:tblPr>
+      <w:tblGrid>
+        <w:gridCol w:w="1662"/>
+        <w:gridCol w:w="1662"/>
+        <w:gridCol w:w="1662"/>
+        <w:gridCol w:w="1662"/>
+        <w:gridCol w:w="1662"/>
+        <w:gridCol w:w="1662"/>
+      </w:tblGrid>
+      <w:tr>
+        <w:tc>
+          <w:tcPr>
+            <w:tcW w:type="dxa" w:w="576"/>
+            <w:shd w:fill="D6E4F0" w:val="clear"/>
+          </w:tcPr>
+          <w:p>
+            <w:r>
+              <w:rPr>
+                <w:b/>
+                <w:sz w:val="18"/>
+              </w:rPr>
+              <w:t>Step</w:t>
+            </w:r>
+          </w:p>
+        </w:tc>
+        <w:tc>
+          <w:tcPr>
+            <w:tcW w:type="dxa" w:w="2016"/>
+            <w:shd w:fill="D6E4F0" w:val="clear"/>
+          </w:tcPr>
+          <w:p>
+            <w:r>
+              <w:rPr>
+                <w:b/>
+                <w:sz w:val="18"/>
+              </w:rPr>
+              <w:t>Node Expanded</w:t>
+            </w:r>
+          </w:p>
+        </w:tc>
+        <w:tc>
+          <w:tcPr>
+            <w:tcW w:type="dxa" w:w="864"/>
+            <w:shd w:fill="D6E4F0" w:val="clear"/>
+          </w:tcPr>
+          <w:p>
+            <w:r>
+              <w:rPr>
+                <w:b/>
+                <w:sz w:val="18"/>
+              </w:rPr>
+              <w:t>g(n)</w:t>
+            </w:r>
+          </w:p>
+        </w:tc>
+        <w:tc>
+          <w:tcPr>
+            <w:tcW w:type="dxa" w:w="864"/>
+            <w:shd w:fill="D6E4F0" w:val="clear"/>
+          </w:tcPr>
+          <w:p>
+            <w:r>
+              <w:rPr>
+                <w:b/>
+                <w:sz w:val="18"/>
+              </w:rPr>
+              <w:t>h(n)</w:t>
+            </w:r>
+          </w:p>
+        </w:tc>
+        <w:tc>
+          <w:tcPr>
+            <w:tcW w:type="dxa" w:w="1008"/>
+            <w:shd w:fill="D6E4F0" w:val="clear"/>
+          </w:tcPr>
+          <w:p>
+            <w:r>
+              <w:rPr>
+                <w:b/>
+                <w:sz w:val="18"/>
+              </w:rPr>
+              <w:t>f=g+h</w:t>
+            </w:r>
+          </w:p>
+        </w:tc>
+        <w:tc>
+          <w:tcPr>
+            <w:tcW w:type="dxa" w:w="4464"/>
+            <w:shd w:fill="D6E4F0" w:val="clear"/>
+          </w:tcPr>
+          <w:p>
+            <w:r>
+              <w:rPr>
+                <w:b/>
+                <w:sz w:val="18"/>
+              </w:rPr>
+              <w:t>Key Frontier After Expansion</w:t>
+            </w:r>
+          </w:p>
+        </w:tc>
+      </w:tr>
+      <w:tr>
+        <w:tc>
+          <w:tcPr>
+            <w:tcW w:type="dxa" w:w="576"/>
+          </w:tcPr>
+          <w:p>
+            <w:r>
+              <w:rPr>
+                <w:sz w:val="18"/>
+              </w:rPr>
+              <w:t>1</w:t>
+            </w:r>
+          </w:p>
+        </w:tc>
+        <w:tc>
+          <w:tcPr>
+            <w:tcW w:type="dxa" w:w="2016"/>
+          </w:tcPr>
+          <w:p>
+            <w:r>
+              <w:rPr>
+                <w:sz w:val="18"/>
+              </w:rPr>
+              <w:t>Timisoara</w:t>
+            </w:r>
+          </w:p>
+        </w:tc>
+        <w:tc>
+          <w:tcPr>
+            <w:tcW w:type="dxa" w:w="864"/>
+          </w:tcPr>
+          <w:p>
+            <w:r>
+              <w:rPr>
+                <w:sz w:val="18"/>
+              </w:rPr>
+              <w:t>0</w:t>
+            </w:r>
+          </w:p>
+        </w:tc>
+        <w:tc>
+          <w:tcPr>
+            <w:tcW w:type="dxa" w:w="864"/>
+          </w:tcPr>
+          <w:p>
+            <w:r>
+              <w:rPr>
+                <w:sz w:val="18"/>
+              </w:rPr>
+              <w:t>329</w:t>
+            </w:r>
+          </w:p>
+        </w:tc>
+        <w:tc>
+          <w:tcPr>
+            <w:tcW w:type="dxa" w:w="1008"/>
+          </w:tcPr>
+          <w:p>
+            <w:r>
+              <w:rPr>
+                <w:sz w:val="18"/>
+              </w:rPr>
+              <w:t>329</w:t>
+            </w:r>
+          </w:p>
+        </w:tc>
+        <w:tc>
+          <w:tcPr>
+            <w:tcW w:type="dxa" w:w="4464"/>
+          </w:tcPr>
+          <w:p>
+            <w:r>
+              <w:rPr>
+                <w:sz w:val="18"/>
+              </w:rPr>
+              <w:t>Lugoj(f=355), Arad(f=484)</w:t>
+            </w:r>
+          </w:p>
+        </w:tc>
+      </w:tr>
+      <w:tr>
+        <w:tc>
+          <w:tcPr>
+            <w:tcW w:type="dxa" w:w="576"/>
+          </w:tcPr>
+          <w:p>
+            <w:r>
+              <w:rPr>
+                <w:sz w:val="18"/>
+              </w:rPr>
+              <w:t>2</w:t>
+            </w:r>
+          </w:p>
+        </w:tc>
+        <w:tc>
+          <w:tcPr>
+            <w:tcW w:type="dxa" w:w="2016"/>
+          </w:tcPr>
+          <w:p>
+            <w:r>
+              <w:rPr>
+                <w:sz w:val="18"/>
+              </w:rPr>
+              <w:t>Lugoj</w:t>
+            </w:r>
+          </w:p>
+        </w:tc>
+        <w:tc>
+          <w:tcPr>
+            <w:tcW w:type="dxa" w:w="864"/>
+          </w:tcPr>
+          <w:p>
+            <w:r>
+              <w:rPr>
+                <w:sz w:val="18"/>
+              </w:rPr>
+              <w:t>111</w:t>
+            </w:r>
+          </w:p>
+        </w:tc>
+        <w:tc>
+          <w:tcPr>
+            <w:tcW w:type="dxa" w:w="864"/>
+          </w:tcPr>
+          <w:p>
+            <w:r>
+              <w:rPr>
+                <w:sz w:val="18"/>
+              </w:rPr>
+              <w:t>244</w:t>
+            </w:r>
+          </w:p>
+        </w:tc>
+        <w:tc>
+          <w:tcPr>
+            <w:tcW w:type="dxa" w:w="1008"/>
+          </w:tcPr>
+          <w:p>
+            <w:r>
+              <w:rPr>
+                <w:sz w:val="18"/>
+              </w:rPr>
+              <w:t>355</w:t>
+            </w:r>
+          </w:p>
+        </w:tc>
+        <w:tc>
+          <w:tcPr>
+            <w:tcW w:type="dxa" w:w="4464"/>
+          </w:tcPr>
+          <w:p>
+            <w:r>
+              <w:rPr>
+                <w:sz w:val="18"/>
+              </w:rPr>
+              <w:t>Mehadia(f=422), Arad(f=484)</w:t>
+            </w:r>
+          </w:p>
+        </w:tc>
+      </w:tr>
+      <w:tr>
+        <w:tc>
+          <w:tcPr>
+            <w:tcW w:type="dxa" w:w="576"/>
+          </w:tcPr>
+          <w:p>
+            <w:r>
+              <w:rPr>
+                <w:sz w:val="18"/>
+              </w:rPr>
+              <w:t>3</w:t>
+            </w:r>
+          </w:p>
+        </w:tc>
+        <w:tc>
+          <w:tcPr>
+            <w:tcW w:type="dxa" w:w="2016"/>
+          </w:tcPr>
+          <w:p>
+            <w:r>
+              <w:rPr>
+                <w:sz w:val="18"/>
+              </w:rPr>
+              <w:t>Mehadia</w:t>
+            </w:r>
+          </w:p>
+        </w:tc>
+        <w:tc>
+          <w:tcPr>
+            <w:tcW w:type="dxa" w:w="864"/>
+          </w:tcPr>
+          <w:p>
+            <w:r>
+              <w:rPr>
+                <w:sz w:val="18"/>
+              </w:rPr>
+              <w:t>181</w:t>
+            </w:r>
+          </w:p>
+        </w:tc>
+        <w:tc>
+          <w:tcPr>
+            <w:tcW w:type="dxa" w:w="864"/>
+          </w:tcPr>
+          <w:p>
+            <w:r>
+              <w:rPr>
+                <w:sz w:val="18"/>
+              </w:rPr>
+              <w:t>241</w:t>
+            </w:r>
+          </w:p>
+        </w:tc>
+        <w:tc>
+          <w:tcPr>
+            <w:tcW w:type="dxa" w:w="1008"/>
+          </w:tcPr>
+          <w:p>
+            <w:r>
+              <w:rPr>
+                <w:sz w:val="18"/>
+              </w:rPr>
+              <w:t>422</w:t>
+            </w:r>
+          </w:p>
+        </w:tc>
+        <w:tc>
+          <w:tcPr>
+            <w:tcW w:type="dxa" w:w="4464"/>
+          </w:tcPr>
+          <w:p>
+            <w:r>
+              <w:rPr>
+                <w:sz w:val="18"/>
+              </w:rPr>
+              <w:t>Arad(f=484), Dobreta(f=498)</w:t>
+            </w:r>
+          </w:p>
+        </w:tc>
+      </w:tr>
+      <w:tr>
+        <w:tc>
+          <w:tcPr>
+            <w:tcW w:type="dxa" w:w="576"/>
+          </w:tcPr>
+          <w:p>
+            <w:r>
+              <w:rPr>
+                <w:sz w:val="18"/>
+              </w:rPr>
+              <w:t>4</w:t>
+            </w:r>
+          </w:p>
+        </w:tc>
+        <w:tc>
+          <w:tcPr>
+            <w:tcW w:type="dxa" w:w="2016"/>
+          </w:tcPr>
+          <w:p>
+            <w:r>
+              <w:rPr>
+                <w:sz w:val="18"/>
+              </w:rPr>
+              <w:t>Arad</w:t>
+            </w:r>
+          </w:p>
+        </w:tc>
+        <w:tc>
+          <w:tcPr>
+            <w:tcW w:type="dxa" w:w="864"/>
+          </w:tcPr>
+          <w:p>
+            <w:r>
+              <w:rPr>
+                <w:sz w:val="18"/>
+              </w:rPr>
+              <w:t>118</w:t>
+            </w:r>
+          </w:p>
+        </w:tc>
+        <w:tc>
+          <w:tcPr>
+            <w:tcW w:type="dxa" w:w="864"/>
+          </w:tcPr>
+          <w:p>
+            <w:r>
+              <w:rPr>
+                <w:sz w:val="18"/>
+              </w:rPr>
+              <w:t>366</w:t>
+            </w:r>
+          </w:p>
+        </w:tc>
+        <w:tc>
+          <w:tcPr>
+            <w:tcW w:type="dxa" w:w="1008"/>
+          </w:tcPr>
+          <w:p>
+            <w:r>
+              <w:rPr>
+                <w:sz w:val="18"/>
+              </w:rPr>
+              <w:t>484</w:t>
+            </w:r>
+          </w:p>
+        </w:tc>
+        <w:tc>
+          <w:tcPr>
+            <w:tcW w:type="dxa" w:w="4464"/>
+          </w:tcPr>
+          <w:p>
+            <w:r>
+              <w:rPr>
+                <w:sz w:val="18"/>
+              </w:rPr>
+              <w:t>Dobreta(f=498), Sibiu(f=511)</w:t>
+            </w:r>
+          </w:p>
+        </w:tc>
+      </w:tr>
+      <w:tr>
+        <w:tc>
+          <w:tcPr>
+            <w:tcW w:type="dxa" w:w="576"/>
+          </w:tcPr>
+          <w:p>
+            <w:r>
+              <w:rPr>
+                <w:sz w:val="18"/>
+              </w:rPr>
+              <w:t>5</w:t>
+            </w:r>
+          </w:p>
+        </w:tc>
+        <w:tc>
+          <w:tcPr>
+            <w:tcW w:type="dxa" w:w="2016"/>
+          </w:tcPr>
+          <w:p>
+            <w:r>
+              <w:rPr>
+                <w:sz w:val="18"/>
+              </w:rPr>
+              <w:t>Dobreta</w:t>
+            </w:r>
+          </w:p>
+        </w:tc>
+        <w:tc>
+          <w:tcPr>
+            <w:tcW w:type="dxa" w:w="864"/>
+          </w:tcPr>
+          <w:p>
+            <w:r>
+              <w:rPr>
+                <w:sz w:val="18"/>
+              </w:rPr>
+              <w:t>256</w:t>
+            </w:r>
+          </w:p>
+        </w:tc>
+        <w:tc>
+          <w:tcPr>
+            <w:tcW w:type="dxa" w:w="864"/>
+          </w:tcPr>
+          <w:p>
+            <w:r>
+              <w:rPr>
+                <w:sz w:val="18"/>
+              </w:rPr>
+              <w:t>242</w:t>
+            </w:r>
+          </w:p>
+        </w:tc>
+        <w:tc>
+          <w:tcPr>
+            <w:tcW w:type="dxa" w:w="1008"/>
+          </w:tcPr>
+          <w:p>
+            <w:r>
+              <w:rPr>
+                <w:sz w:val="18"/>
+              </w:rPr>
+              <w:t>498</w:t>
+            </w:r>
+          </w:p>
+        </w:tc>
+        <w:tc>
+          <w:tcPr>
+            <w:tcW w:type="dxa" w:w="4464"/>
+          </w:tcPr>
+          <w:p>
+            <w:r>
+              <w:rPr>
+                <w:sz w:val="18"/>
+              </w:rPr>
+              <w:t>Sibiu(f=511), Craiova(f=536)</w:t>
+            </w:r>
+          </w:p>
+        </w:tc>
+      </w:tr>
+      <w:tr>
+        <w:tc>
+          <w:tcPr>
+            <w:tcW w:type="dxa" w:w="576"/>
+          </w:tcPr>
+          <w:p>
+            <w:r>
+              <w:rPr>
+                <w:sz w:val="18"/>
+              </w:rPr>
+              <w:t>6</w:t>
+            </w:r>
+          </w:p>
+        </w:tc>
+        <w:tc>
+          <w:tcPr>
+            <w:tcW w:type="dxa" w:w="2016"/>
+          </w:tcPr>
+          <w:p>
+            <w:r>
+              <w:rPr>
+                <w:sz w:val="18"/>
+              </w:rPr>
+              <w:t>Sibiu</w:t>
+            </w:r>
+          </w:p>
+        </w:tc>
+        <w:tc>
+          <w:tcPr>
+            <w:tcW w:type="dxa" w:w="864"/>
+          </w:tcPr>
+          <w:p>
+            <w:r>
+              <w:rPr>
+                <w:sz w:val="18"/>
+              </w:rPr>
+              <w:t>258</w:t>
+            </w:r>
+          </w:p>
+        </w:tc>
+        <w:tc>
+          <w:tcPr>
+            <w:tcW w:type="dxa" w:w="864"/>
+          </w:tcPr>
+          <w:p>
+            <w:r>
+              <w:rPr>
+                <w:sz w:val="18"/>
+              </w:rPr>
+              <w:t>253</w:t>
+            </w:r>
+          </w:p>
+        </w:tc>
+        <w:tc>
+          <w:tcPr>
+            <w:tcW w:type="dxa" w:w="1008"/>
+          </w:tcPr>
+          <w:p>
+            <w:r>
+              <w:rPr>
+                <w:sz w:val="18"/>
+              </w:rPr>
+              <w:t>511</w:t>
+            </w:r>
+          </w:p>
+        </w:tc>
+        <w:tc>
+          <w:tcPr>
+            <w:tcW w:type="dxa" w:w="4464"/>
+          </w:tcPr>
+          <w:p>
+            <w:r>
+              <w:rPr>
+                <w:sz w:val="18"/>
+              </w:rPr>
+              <w:t>RimnicuVilcea(f=531), Fagaras(f=533), Craiova(f=536)</w:t>
+            </w:r>
+          </w:p>
+        </w:tc>
+      </w:tr>
+      <w:tr>
+        <w:tc>
+          <w:tcPr>
+            <w:tcW w:type="dxa" w:w="576"/>
+          </w:tcPr>
+          <w:p>
+            <w:r>
+              <w:rPr>
+                <w:sz w:val="18"/>
+              </w:rPr>
+              <w:t>7</w:t>
+            </w:r>
+          </w:p>
+        </w:tc>
+        <w:tc>
+          <w:tcPr>
+            <w:tcW w:type="dxa" w:w="2016"/>
+          </w:tcPr>
+          <w:p>
+            <w:r>
+              <w:rPr>
+                <w:sz w:val="18"/>
+              </w:rPr>
+              <w:t>RimnicuVilcea</w:t>
+            </w:r>
+          </w:p>
+        </w:tc>
+        <w:tc>
+          <w:tcPr>
+            <w:tcW w:type="dxa" w:w="864"/>
+          </w:tcPr>
+          <w:p>
+            <w:r>
+              <w:rPr>
+                <w:sz w:val="18"/>
+              </w:rPr>
+              <w:t>338</w:t>
+            </w:r>
+          </w:p>
+        </w:tc>
+        <w:tc>
+          <w:tcPr>
+            <w:tcW w:type="dxa" w:w="864"/>
+          </w:tcPr>
+          <w:p>
+            <w:r>
+              <w:rPr>
+                <w:sz w:val="18"/>
+              </w:rPr>
+              <w:t>193</w:t>
+            </w:r>
+          </w:p>
+        </w:tc>
+        <w:tc>
+          <w:tcPr>
+            <w:tcW w:type="dxa" w:w="1008"/>
+          </w:tcPr>
+          <w:p>
+            <w:r>
+              <w:rPr>
+                <w:sz w:val="18"/>
+              </w:rPr>
+              <w:t>531</w:t>
+            </w:r>
+          </w:p>
+        </w:tc>
+        <w:tc>
+          <w:tcPr>
+            <w:tcW w:type="dxa" w:w="4464"/>
+          </w:tcPr>
+          <w:p>
+            <w:r>
+              <w:rPr>
+                <w:sz w:val="18"/>
+              </w:rPr>
+              <w:t>Fagaras(f=533), Pitesti(f=535), Craiova(f=536)</w:t>
+            </w:r>
+          </w:p>
+        </w:tc>
+      </w:tr>
+      <w:tr>
+        <w:tc>
+          <w:tcPr>
+            <w:tcW w:type="dxa" w:w="576"/>
+          </w:tcPr>
+          <w:p>
+            <w:r>
+              <w:rPr>
+                <w:sz w:val="18"/>
+              </w:rPr>
+              <w:t>8</w:t>
+            </w:r>
+          </w:p>
+        </w:tc>
+        <w:tc>
+          <w:tcPr>
+            <w:tcW w:type="dxa" w:w="2016"/>
+          </w:tcPr>
+          <w:p>
+            <w:r>
+              <w:rPr>
+                <w:sz w:val="18"/>
+              </w:rPr>
+              <w:t>Fagaras</w:t>
+            </w:r>
+          </w:p>
+        </w:tc>
+        <w:tc>
+          <w:tcPr>
+            <w:tcW w:type="dxa" w:w="864"/>
+          </w:tcPr>
+          <w:p>
+            <w:r>
+              <w:rPr>
+                <w:sz w:val="18"/>
+              </w:rPr>
+              <w:t>357</w:t>
+            </w:r>
+          </w:p>
+        </w:tc>
+        <w:tc>
+          <w:tcPr>
+            <w:tcW w:type="dxa" w:w="864"/>
+          </w:tcPr>
+          <w:p>
+            <w:r>
+              <w:rPr>
+                <w:sz w:val="18"/>
+              </w:rPr>
+              <w:t>176</w:t>
+            </w:r>
+          </w:p>
+        </w:tc>
+        <w:tc>
+          <w:tcPr>
+            <w:tcW w:type="dxa" w:w="1008"/>
+          </w:tcPr>
+          <w:p>
+            <w:r>
+              <w:rPr>
+                <w:sz w:val="18"/>
+              </w:rPr>
+              <w:t>533</w:t>
+            </w:r>
+          </w:p>
+        </w:tc>
+        <w:tc>
+          <w:tcPr>
+            <w:tcW w:type="dxa" w:w="4464"/>
+          </w:tcPr>
+          <w:p>
+            <w:r>
+              <w:rPr>
+                <w:sz w:val="18"/>
+              </w:rPr>
+              <w:t>Pitesti(f=535), Craiova(f=536), Bucharest_via_Fagaras(f=568)</w:t>
+            </w:r>
+          </w:p>
+        </w:tc>
+      </w:tr>
+      <w:tr>
+        <w:tc>
+          <w:tcPr>
+            <w:tcW w:type="dxa" w:w="576"/>
+          </w:tcPr>
+          <w:p>
+            <w:r>
+              <w:rPr>
+                <w:sz w:val="18"/>
+              </w:rPr>
+              <w:t>9</w:t>
+            </w:r>
+          </w:p>
+        </w:tc>
+        <w:tc>
+          <w:tcPr>
+            <w:tcW w:type="dxa" w:w="2016"/>
+          </w:tcPr>
+          <w:p>
+            <w:r>
+              <w:rPr>
+                <w:sz w:val="18"/>
+              </w:rPr>
+              <w:t>Pitesti</w:t>
+            </w:r>
+          </w:p>
+        </w:tc>
+        <w:tc>
+          <w:tcPr>
+            <w:tcW w:type="dxa" w:w="864"/>
+          </w:tcPr>
+          <w:p>
+            <w:r>
+              <w:rPr>
+                <w:sz w:val="18"/>
+              </w:rPr>
+              <w:t>435</w:t>
+            </w:r>
+          </w:p>
+        </w:tc>
+        <w:tc>
+          <w:tcPr>
+            <w:tcW w:type="dxa" w:w="864"/>
+          </w:tcPr>
+          <w:p>
+            <w:r>
+              <w:rPr>
+                <w:sz w:val="18"/>
+              </w:rPr>
+              <w:t>100</w:t>
+            </w:r>
+          </w:p>
+        </w:tc>
+        <w:tc>
+          <w:tcPr>
+            <w:tcW w:type="dxa" w:w="1008"/>
+          </w:tcPr>
+          <w:p>
+            <w:r>
+              <w:rPr>
+                <w:sz w:val="18"/>
+              </w:rPr>
+              <w:t>535</w:t>
+            </w:r>
+          </w:p>
+        </w:tc>
+        <w:tc>
+          <w:tcPr>
+            <w:tcW w:type="dxa" w:w="4464"/>
+          </w:tcPr>
+          <w:p>
+            <w:r>
+              <w:rPr>
+                <w:sz w:val="18"/>
+              </w:rPr>
+              <w:t>Craiova(f=536), Bucharest_via_Pitesti(f=536) — replaces f=568</w:t>
+            </w:r>
+          </w:p>
+        </w:tc>
+      </w:tr>
+      <w:tr>
+        <w:tc>
+          <w:tcPr>
+            <w:tcW w:type="dxa" w:w="576"/>
+          </w:tcPr>
+          <w:p>
+            <w:r>
+              <w:rPr>
+                <w:sz w:val="18"/>
+              </w:rPr>
+              <w:t>10</w:t>
+            </w:r>
+          </w:p>
+        </w:tc>
+        <w:tc>
+          <w:tcPr>
+            <w:tcW w:type="dxa" w:w="2016"/>
+          </w:tcPr>
+          <w:p>
+            <w:r>
+              <w:rPr>
+                <w:sz w:val="18"/>
+              </w:rPr>
+              <w:t>Bucharest</w:t>
+            </w:r>
+          </w:p>
+        </w:tc>
+        <w:tc>
+          <w:tcPr>
+            <w:tcW w:type="dxa" w:w="864"/>
+          </w:tcPr>
+          <w:p>
+            <w:r>
+              <w:rPr>
+                <w:sz w:val="18"/>
+              </w:rPr>
+              <w:t>536</w:t>
+            </w:r>
+          </w:p>
+        </w:tc>
+        <w:tc>
+          <w:tcPr>
+            <w:tcW w:type="dxa" w:w="864"/>
+          </w:tcPr>
+          <w:p>
+            <w:r>
+              <w:rPr>
+                <w:sz w:val="18"/>
+              </w:rPr>
+              <w:t>0</w:t>
+            </w:r>
+          </w:p>
+        </w:tc>
+        <w:tc>
+          <w:tcPr>
+            <w:tcW w:type="dxa" w:w="1008"/>
+          </w:tcPr>
+          <w:p>
+            <w:r>
+              <w:rPr>
+                <w:sz w:val="18"/>
+              </w:rPr>
+              <w:t>536</w:t>
+            </w:r>
+          </w:p>
+        </w:tc>
+        <w:tc>
+          <w:tcPr>
+            <w:tcW w:type="dxa" w:w="4464"/>
+          </w:tcPr>
+          <w:p>
+            <w:r>
+              <w:rPr>
+                <w:sz w:val="18"/>
+              </w:rPr>
+              <w:t>GOAL — stop</w:t>
+            </w:r>
+          </w:p>
+        </w:tc>
+      </w:tr>
+    </w:tbl>
+    <w:p>
+      <w:pPr>
+        <w:spacing w:after="0"/>
+      </w:pPr>
+    </w:p>
+    <w:p>
+      <w:pPr>
+        <w:ind w:left="320"/>
+      </w:pPr>
+      <w:r>
+        <w:rPr>
+          <w:b/>
+          <w:sz w:val="20"/>
+        </w:rPr>
+        <w:t xml:space="preserve">ANSWER: </w:t>
+      </w:r>
+      <w:r>
+        <w:rPr>
+          <w:sz w:val="20"/>
+        </w:rPr>
+        <w:t>Path: Timisoara → Arad → Sibiu → Rimnicu Vilcea → Pitesti → Bucharest   Cost = 118+140+80+97+101 = 536 km</w:t>
+      </w:r>
+    </w:p>
+    <w:p>
+      <w:pPr>
+        <w:spacing w:after="40"/>
+        <w:ind w:left="240"/>
+      </w:pPr>
+      <w:r>
+        <w:rPr>
+          <w:b/>
+          <w:color w:val="C05500"/>
+          <w:sz w:val="20"/>
+        </w:rPr>
+        <w:t xml:space="preserve">EXAM TIP: </w:t>
+      </w:r>
+      <w:r>
+        <w:rPr>
+          <w:color w:val="C05500"/>
+          <w:sz w:val="20"/>
+        </w:rPr>
+        <w:t>Arad expanded BEFORE Dobreta (f=484 &lt; 498) even though it is not on the optimal path — A* explores it because SLD overestimates. Bucharest via Fagaras (f=568) is replaced when Pitesti finds shorter route (f=536).</w:t>
       </w:r>
     </w:p>
     <w:p>
@@ -6385,6 +7409,1033 @@
           <w:sz w:val="20"/>
         </w:rPr>
         <w:t>P(W|C) = P(C|W)*P(W) / P(C) = 0.762*0.6 / 0.5588 = 0.4572/0.5588 = 0.8182</w:t>
+      </w:r>
+    </w:p>
+    <w:p>
+      <w:pPr>
+        <w:spacing w:after="0"/>
+      </w:pPr>
+    </w:p>
+    <w:p>
+      <w:pPr>
+        <w:pStyle w:val="Heading3"/>
+      </w:pPr>
+      <w:r>
+        <w:t>Q6 — Decision Tree (8 Students, 3 Features → Pass/Fail) [12 marks]</w:t>
+      </w:r>
+    </w:p>
+    <w:p>
+      <w:pPr>
+        <w:spacing w:after="40"/>
+        <w:ind w:left="240"/>
+      </w:pPr>
+      <w:r>
+        <w:rPr>
+          <w:b w:val="0"/>
+          <w:sz w:val="20"/>
+        </w:rPr>
+        <w:t>Dataset: 8 students. Features: Study Years (0-2, 3-5), Study Hours (Low/Med/High), Attendance (I=Irregular, R=Regular). Target: Pass.</w:t>
+      </w:r>
+    </w:p>
+    <w:tbl>
+      <w:tblPr>
+        <w:tblStyle w:val="TableGrid"/>
+        <w:tblW w:type="auto" w:w="0"/>
+        <w:tblLook w:firstColumn="1" w:firstRow="1" w:lastColumn="0" w:lastRow="0" w:noHBand="0" w:noVBand="1" w:val="04A0"/>
+      </w:tblPr>
+      <w:tblGrid>
+        <w:gridCol w:w="1994"/>
+        <w:gridCol w:w="1994"/>
+        <w:gridCol w:w="1994"/>
+        <w:gridCol w:w="1994"/>
+        <w:gridCol w:w="1994"/>
+      </w:tblGrid>
+      <w:tr>
+        <w:tc>
+          <w:tcPr>
+            <w:tcW w:type="dxa" w:w="576"/>
+            <w:shd w:fill="D6E4F0" w:val="clear"/>
+          </w:tcPr>
+          <w:p>
+            <w:r>
+              <w:rPr>
+                <w:b/>
+                <w:sz w:val="18"/>
+              </w:rPr>
+              <w:t>ID</w:t>
+            </w:r>
+          </w:p>
+        </w:tc>
+        <w:tc>
+          <w:tcPr>
+            <w:tcW w:type="dxa" w:w="1440"/>
+            <w:shd w:fill="D6E4F0" w:val="clear"/>
+          </w:tcPr>
+          <w:p>
+            <w:r>
+              <w:rPr>
+                <w:b/>
+                <w:sz w:val="18"/>
+              </w:rPr>
+              <w:t>Study Years</w:t>
+            </w:r>
+          </w:p>
+        </w:tc>
+        <w:tc>
+          <w:tcPr>
+            <w:tcW w:type="dxa" w:w="1440"/>
+            <w:shd w:fill="D6E4F0" w:val="clear"/>
+          </w:tcPr>
+          <w:p>
+            <w:r>
+              <w:rPr>
+                <w:b/>
+                <w:sz w:val="18"/>
+              </w:rPr>
+              <w:t>Study Hours</w:t>
+            </w:r>
+          </w:p>
+        </w:tc>
+        <w:tc>
+          <w:tcPr>
+            <w:tcW w:type="dxa" w:w="1584"/>
+            <w:shd w:fill="D6E4F0" w:val="clear"/>
+          </w:tcPr>
+          <w:p>
+            <w:r>
+              <w:rPr>
+                <w:b/>
+                <w:sz w:val="18"/>
+              </w:rPr>
+              <w:t>Attendance</w:t>
+            </w:r>
+          </w:p>
+        </w:tc>
+        <w:tc>
+          <w:tcPr>
+            <w:tcW w:type="dxa" w:w="864"/>
+            <w:shd w:fill="D6E4F0" w:val="clear"/>
+          </w:tcPr>
+          <w:p>
+            <w:r>
+              <w:rPr>
+                <w:b/>
+                <w:sz w:val="18"/>
+              </w:rPr>
+              <w:t>Pass</w:t>
+            </w:r>
+          </w:p>
+        </w:tc>
+      </w:tr>
+      <w:tr>
+        <w:tc>
+          <w:tcPr>
+            <w:tcW w:type="dxa" w:w="576"/>
+          </w:tcPr>
+          <w:p>
+            <w:r>
+              <w:rPr>
+                <w:sz w:val="18"/>
+              </w:rPr>
+              <w:t>1</w:t>
+            </w:r>
+          </w:p>
+        </w:tc>
+        <w:tc>
+          <w:tcPr>
+            <w:tcW w:type="dxa" w:w="1440"/>
+          </w:tcPr>
+          <w:p>
+            <w:r>
+              <w:rPr>
+                <w:sz w:val="18"/>
+              </w:rPr>
+              <w:t>0-2</w:t>
+            </w:r>
+          </w:p>
+        </w:tc>
+        <w:tc>
+          <w:tcPr>
+            <w:tcW w:type="dxa" w:w="1440"/>
+          </w:tcPr>
+          <w:p>
+            <w:r>
+              <w:rPr>
+                <w:sz w:val="18"/>
+              </w:rPr>
+              <w:t>Low</w:t>
+            </w:r>
+          </w:p>
+        </w:tc>
+        <w:tc>
+          <w:tcPr>
+            <w:tcW w:type="dxa" w:w="1584"/>
+          </w:tcPr>
+          <w:p>
+            <w:r>
+              <w:rPr>
+                <w:sz w:val="18"/>
+              </w:rPr>
+              <w:t>I</w:t>
+            </w:r>
+          </w:p>
+        </w:tc>
+        <w:tc>
+          <w:tcPr>
+            <w:tcW w:type="dxa" w:w="864"/>
+          </w:tcPr>
+          <w:p>
+            <w:r>
+              <w:rPr>
+                <w:sz w:val="18"/>
+              </w:rPr>
+              <w:t>No</w:t>
+            </w:r>
+          </w:p>
+        </w:tc>
+      </w:tr>
+      <w:tr>
+        <w:tc>
+          <w:tcPr>
+            <w:tcW w:type="dxa" w:w="576"/>
+          </w:tcPr>
+          <w:p>
+            <w:r>
+              <w:rPr>
+                <w:sz w:val="18"/>
+              </w:rPr>
+              <w:t>2</w:t>
+            </w:r>
+          </w:p>
+        </w:tc>
+        <w:tc>
+          <w:tcPr>
+            <w:tcW w:type="dxa" w:w="1440"/>
+          </w:tcPr>
+          <w:p>
+            <w:r>
+              <w:rPr>
+                <w:sz w:val="18"/>
+              </w:rPr>
+              <w:t>0-2</w:t>
+            </w:r>
+          </w:p>
+        </w:tc>
+        <w:tc>
+          <w:tcPr>
+            <w:tcW w:type="dxa" w:w="1440"/>
+          </w:tcPr>
+          <w:p>
+            <w:r>
+              <w:rPr>
+                <w:sz w:val="18"/>
+              </w:rPr>
+              <w:t>Low</w:t>
+            </w:r>
+          </w:p>
+        </w:tc>
+        <w:tc>
+          <w:tcPr>
+            <w:tcW w:type="dxa" w:w="1584"/>
+          </w:tcPr>
+          <w:p>
+            <w:r>
+              <w:rPr>
+                <w:sz w:val="18"/>
+              </w:rPr>
+              <w:t>R</w:t>
+            </w:r>
+          </w:p>
+        </w:tc>
+        <w:tc>
+          <w:tcPr>
+            <w:tcW w:type="dxa" w:w="864"/>
+          </w:tcPr>
+          <w:p>
+            <w:r>
+              <w:rPr>
+                <w:sz w:val="18"/>
+              </w:rPr>
+              <w:t>No</w:t>
+            </w:r>
+          </w:p>
+        </w:tc>
+      </w:tr>
+      <w:tr>
+        <w:tc>
+          <w:tcPr>
+            <w:tcW w:type="dxa" w:w="576"/>
+          </w:tcPr>
+          <w:p>
+            <w:r>
+              <w:rPr>
+                <w:sz w:val="18"/>
+              </w:rPr>
+              <w:t>3</w:t>
+            </w:r>
+          </w:p>
+        </w:tc>
+        <w:tc>
+          <w:tcPr>
+            <w:tcW w:type="dxa" w:w="1440"/>
+          </w:tcPr>
+          <w:p>
+            <w:r>
+              <w:rPr>
+                <w:sz w:val="18"/>
+              </w:rPr>
+              <w:t>3-5</w:t>
+            </w:r>
+          </w:p>
+        </w:tc>
+        <w:tc>
+          <w:tcPr>
+            <w:tcW w:type="dxa" w:w="1440"/>
+          </w:tcPr>
+          <w:p>
+            <w:r>
+              <w:rPr>
+                <w:sz w:val="18"/>
+              </w:rPr>
+              <w:t>Medium</w:t>
+            </w:r>
+          </w:p>
+        </w:tc>
+        <w:tc>
+          <w:tcPr>
+            <w:tcW w:type="dxa" w:w="1584"/>
+          </w:tcPr>
+          <w:p>
+            <w:r>
+              <w:rPr>
+                <w:sz w:val="18"/>
+              </w:rPr>
+              <w:t>I</w:t>
+            </w:r>
+          </w:p>
+        </w:tc>
+        <w:tc>
+          <w:tcPr>
+            <w:tcW w:type="dxa" w:w="864"/>
+          </w:tcPr>
+          <w:p>
+            <w:r>
+              <w:rPr>
+                <w:sz w:val="18"/>
+              </w:rPr>
+              <w:t>No</w:t>
+            </w:r>
+          </w:p>
+        </w:tc>
+      </w:tr>
+      <w:tr>
+        <w:tc>
+          <w:tcPr>
+            <w:tcW w:type="dxa" w:w="576"/>
+          </w:tcPr>
+          <w:p>
+            <w:r>
+              <w:rPr>
+                <w:sz w:val="18"/>
+              </w:rPr>
+              <w:t>4</w:t>
+            </w:r>
+          </w:p>
+        </w:tc>
+        <w:tc>
+          <w:tcPr>
+            <w:tcW w:type="dxa" w:w="1440"/>
+          </w:tcPr>
+          <w:p>
+            <w:r>
+              <w:rPr>
+                <w:sz w:val="18"/>
+              </w:rPr>
+              <w:t>3-5</w:t>
+            </w:r>
+          </w:p>
+        </w:tc>
+        <w:tc>
+          <w:tcPr>
+            <w:tcW w:type="dxa" w:w="1440"/>
+          </w:tcPr>
+          <w:p>
+            <w:r>
+              <w:rPr>
+                <w:sz w:val="18"/>
+              </w:rPr>
+              <w:t>Low</w:t>
+            </w:r>
+          </w:p>
+        </w:tc>
+        <w:tc>
+          <w:tcPr>
+            <w:tcW w:type="dxa" w:w="1584"/>
+          </w:tcPr>
+          <w:p>
+            <w:r>
+              <w:rPr>
+                <w:sz w:val="18"/>
+              </w:rPr>
+              <w:t>I</w:t>
+            </w:r>
+          </w:p>
+        </w:tc>
+        <w:tc>
+          <w:tcPr>
+            <w:tcW w:type="dxa" w:w="864"/>
+          </w:tcPr>
+          <w:p>
+            <w:r>
+              <w:rPr>
+                <w:sz w:val="18"/>
+              </w:rPr>
+              <w:t>No</w:t>
+            </w:r>
+          </w:p>
+        </w:tc>
+      </w:tr>
+      <w:tr>
+        <w:tc>
+          <w:tcPr>
+            <w:tcW w:type="dxa" w:w="576"/>
+          </w:tcPr>
+          <w:p>
+            <w:r>
+              <w:rPr>
+                <w:sz w:val="18"/>
+              </w:rPr>
+              <w:t>5</w:t>
+            </w:r>
+          </w:p>
+        </w:tc>
+        <w:tc>
+          <w:tcPr>
+            <w:tcW w:type="dxa" w:w="1440"/>
+          </w:tcPr>
+          <w:p>
+            <w:r>
+              <w:rPr>
+                <w:sz w:val="18"/>
+              </w:rPr>
+              <w:t>3-5</w:t>
+            </w:r>
+          </w:p>
+        </w:tc>
+        <w:tc>
+          <w:tcPr>
+            <w:tcW w:type="dxa" w:w="1440"/>
+          </w:tcPr>
+          <w:p>
+            <w:r>
+              <w:rPr>
+                <w:sz w:val="18"/>
+              </w:rPr>
+              <w:t>High</w:t>
+            </w:r>
+          </w:p>
+        </w:tc>
+        <w:tc>
+          <w:tcPr>
+            <w:tcW w:type="dxa" w:w="1584"/>
+          </w:tcPr>
+          <w:p>
+            <w:r>
+              <w:rPr>
+                <w:sz w:val="18"/>
+              </w:rPr>
+              <w:t>R</w:t>
+            </w:r>
+          </w:p>
+        </w:tc>
+        <w:tc>
+          <w:tcPr>
+            <w:tcW w:type="dxa" w:w="864"/>
+          </w:tcPr>
+          <w:p>
+            <w:r>
+              <w:rPr>
+                <w:sz w:val="18"/>
+              </w:rPr>
+              <w:t>Yes</w:t>
+            </w:r>
+          </w:p>
+        </w:tc>
+      </w:tr>
+      <w:tr>
+        <w:tc>
+          <w:tcPr>
+            <w:tcW w:type="dxa" w:w="576"/>
+          </w:tcPr>
+          <w:p>
+            <w:r>
+              <w:rPr>
+                <w:sz w:val="18"/>
+              </w:rPr>
+              <w:t>6</w:t>
+            </w:r>
+          </w:p>
+        </w:tc>
+        <w:tc>
+          <w:tcPr>
+            <w:tcW w:type="dxa" w:w="1440"/>
+          </w:tcPr>
+          <w:p>
+            <w:r>
+              <w:rPr>
+                <w:sz w:val="18"/>
+              </w:rPr>
+              <w:t>0-2</w:t>
+            </w:r>
+          </w:p>
+        </w:tc>
+        <w:tc>
+          <w:tcPr>
+            <w:tcW w:type="dxa" w:w="1440"/>
+          </w:tcPr>
+          <w:p>
+            <w:r>
+              <w:rPr>
+                <w:sz w:val="18"/>
+              </w:rPr>
+              <w:t>High</w:t>
+            </w:r>
+          </w:p>
+        </w:tc>
+        <w:tc>
+          <w:tcPr>
+            <w:tcW w:type="dxa" w:w="1584"/>
+          </w:tcPr>
+          <w:p>
+            <w:r>
+              <w:rPr>
+                <w:sz w:val="18"/>
+              </w:rPr>
+              <w:t>I</w:t>
+            </w:r>
+          </w:p>
+        </w:tc>
+        <w:tc>
+          <w:tcPr>
+            <w:tcW w:type="dxa" w:w="864"/>
+          </w:tcPr>
+          <w:p>
+            <w:r>
+              <w:rPr>
+                <w:sz w:val="18"/>
+              </w:rPr>
+              <w:t>Yes</w:t>
+            </w:r>
+          </w:p>
+        </w:tc>
+      </w:tr>
+      <w:tr>
+        <w:tc>
+          <w:tcPr>
+            <w:tcW w:type="dxa" w:w="576"/>
+          </w:tcPr>
+          <w:p>
+            <w:r>
+              <w:rPr>
+                <w:sz w:val="18"/>
+              </w:rPr>
+              <w:t>7</w:t>
+            </w:r>
+          </w:p>
+        </w:tc>
+        <w:tc>
+          <w:tcPr>
+            <w:tcW w:type="dxa" w:w="1440"/>
+          </w:tcPr>
+          <w:p>
+            <w:r>
+              <w:rPr>
+                <w:sz w:val="18"/>
+              </w:rPr>
+              <w:t>0-2</w:t>
+            </w:r>
+          </w:p>
+        </w:tc>
+        <w:tc>
+          <w:tcPr>
+            <w:tcW w:type="dxa" w:w="1440"/>
+          </w:tcPr>
+          <w:p>
+            <w:r>
+              <w:rPr>
+                <w:sz w:val="18"/>
+              </w:rPr>
+              <w:t>High</w:t>
+            </w:r>
+          </w:p>
+        </w:tc>
+        <w:tc>
+          <w:tcPr>
+            <w:tcW w:type="dxa" w:w="1584"/>
+          </w:tcPr>
+          <w:p>
+            <w:r>
+              <w:rPr>
+                <w:sz w:val="18"/>
+              </w:rPr>
+              <w:t>R</w:t>
+            </w:r>
+          </w:p>
+        </w:tc>
+        <w:tc>
+          <w:tcPr>
+            <w:tcW w:type="dxa" w:w="864"/>
+          </w:tcPr>
+          <w:p>
+            <w:r>
+              <w:rPr>
+                <w:sz w:val="18"/>
+              </w:rPr>
+              <w:t>Yes</w:t>
+            </w:r>
+          </w:p>
+        </w:tc>
+      </w:tr>
+      <w:tr>
+        <w:tc>
+          <w:tcPr>
+            <w:tcW w:type="dxa" w:w="576"/>
+          </w:tcPr>
+          <w:p>
+            <w:r>
+              <w:rPr>
+                <w:sz w:val="18"/>
+              </w:rPr>
+              <w:t>8</w:t>
+            </w:r>
+          </w:p>
+        </w:tc>
+        <w:tc>
+          <w:tcPr>
+            <w:tcW w:type="dxa" w:w="1440"/>
+          </w:tcPr>
+          <w:p>
+            <w:r>
+              <w:rPr>
+                <w:sz w:val="18"/>
+              </w:rPr>
+              <w:t>3-5</w:t>
+            </w:r>
+          </w:p>
+        </w:tc>
+        <w:tc>
+          <w:tcPr>
+            <w:tcW w:type="dxa" w:w="1440"/>
+          </w:tcPr>
+          <w:p>
+            <w:r>
+              <w:rPr>
+                <w:sz w:val="18"/>
+              </w:rPr>
+              <w:t>Medium</w:t>
+            </w:r>
+          </w:p>
+        </w:tc>
+        <w:tc>
+          <w:tcPr>
+            <w:tcW w:type="dxa" w:w="1584"/>
+          </w:tcPr>
+          <w:p>
+            <w:r>
+              <w:rPr>
+                <w:sz w:val="18"/>
+              </w:rPr>
+              <w:t>R</w:t>
+            </w:r>
+          </w:p>
+        </w:tc>
+        <w:tc>
+          <w:tcPr>
+            <w:tcW w:type="dxa" w:w="864"/>
+          </w:tcPr>
+          <w:p>
+            <w:r>
+              <w:rPr>
+                <w:sz w:val="18"/>
+              </w:rPr>
+              <w:t>Yes</w:t>
+            </w:r>
+          </w:p>
+        </w:tc>
+      </w:tr>
+    </w:tbl>
+    <w:p>
+      <w:pPr>
+        <w:spacing w:after="0"/>
+      </w:pPr>
+    </w:p>
+    <w:p>
+      <w:pPr>
+        <w:spacing w:after="40"/>
+        <w:ind w:left="320"/>
+      </w:pPr>
+      <w:r>
+        <w:rPr>
+          <w:rFonts w:ascii="Courier New" w:hAnsi="Courier New"/>
+          <w:b/>
+          <w:sz w:val="20"/>
+        </w:rPr>
+        <w:t>H(S) = -4/8*log2(4/8) - 4/8*log2(4/8) = 1.0</w:t>
+      </w:r>
+    </w:p>
+    <w:p>
+      <w:pPr>
+        <w:spacing w:after="40"/>
+        <w:ind w:left="240"/>
+      </w:pPr>
+      <w:r>
+        <w:rPr>
+          <w:b w:val="0"/>
+          <w:sz w:val="20"/>
+        </w:rPr>
+        <w:t>Step 1 — Information Gain for each feature:</w:t>
+      </w:r>
+    </w:p>
+    <w:tbl>
+      <w:tblPr>
+        <w:tblStyle w:val="TableGrid"/>
+        <w:tblW w:type="auto" w:w="0"/>
+        <w:tblLook w:firstColumn="1" w:firstRow="1" w:lastColumn="0" w:lastRow="0" w:noHBand="0" w:noVBand="1" w:val="04A0"/>
+      </w:tblPr>
+      <w:tblGrid>
+        <w:gridCol w:w="2493"/>
+        <w:gridCol w:w="2493"/>
+        <w:gridCol w:w="2493"/>
+        <w:gridCol w:w="2493"/>
+      </w:tblGrid>
+      <w:tr>
+        <w:tc>
+          <w:tcPr>
+            <w:tcW w:type="dxa" w:w="1584"/>
+            <w:shd w:fill="D6E4F0" w:val="clear"/>
+          </w:tcPr>
+          <w:p>
+            <w:r>
+              <w:rPr>
+                <w:b/>
+                <w:sz w:val="18"/>
+              </w:rPr>
+              <w:t>Feature</w:t>
+            </w:r>
+          </w:p>
+        </w:tc>
+        <w:tc>
+          <w:tcPr>
+            <w:tcW w:type="dxa" w:w="3456"/>
+            <w:shd w:fill="D6E4F0" w:val="clear"/>
+          </w:tcPr>
+          <w:p>
+            <w:r>
+              <w:rPr>
+                <w:b/>
+                <w:sz w:val="18"/>
+              </w:rPr>
+              <w:t>Partitions</w:t>
+            </w:r>
+          </w:p>
+        </w:tc>
+        <w:tc>
+          <w:tcPr>
+            <w:tcW w:type="dxa" w:w="1872"/>
+            <w:shd w:fill="D6E4F0" w:val="clear"/>
+          </w:tcPr>
+          <w:p>
+            <w:r>
+              <w:rPr>
+                <w:b/>
+                <w:sz w:val="18"/>
+              </w:rPr>
+              <w:t>Partition H</w:t>
+            </w:r>
+          </w:p>
+        </w:tc>
+        <w:tc>
+          <w:tcPr>
+            <w:tcW w:type="dxa" w:w="2592"/>
+            <w:shd w:fill="D6E4F0" w:val="clear"/>
+          </w:tcPr>
+          <w:p>
+            <w:r>
+              <w:rPr>
+                <w:b/>
+                <w:sz w:val="18"/>
+              </w:rPr>
+              <w:t>IG = 1.0 - weighted avg H</w:t>
+            </w:r>
+          </w:p>
+        </w:tc>
+      </w:tr>
+      <w:tr>
+        <w:tc>
+          <w:tcPr>
+            <w:tcW w:type="dxa" w:w="1584"/>
+          </w:tcPr>
+          <w:p>
+            <w:r>
+              <w:rPr>
+                <w:sz w:val="18"/>
+              </w:rPr>
+              <w:t>Study Years</w:t>
+            </w:r>
+          </w:p>
+        </w:tc>
+        <w:tc>
+          <w:tcPr>
+            <w:tcW w:type="dxa" w:w="3456"/>
+          </w:tcPr>
+          <w:p>
+            <w:r>
+              <w:rPr>
+                <w:sz w:val="18"/>
+              </w:rPr>
+              <w:t>0-2: {1,2,6,7}=2Y2N; 3-5: {3,4,5,8}=2Y2N</w:t>
+            </w:r>
+          </w:p>
+        </w:tc>
+        <w:tc>
+          <w:tcPr>
+            <w:tcW w:type="dxa" w:w="1872"/>
+          </w:tcPr>
+          <w:p>
+            <w:r>
+              <w:rPr>
+                <w:sz w:val="18"/>
+              </w:rPr>
+              <w:t>H=1.0 each</w:t>
+            </w:r>
+          </w:p>
+        </w:tc>
+        <w:tc>
+          <w:tcPr>
+            <w:tcW w:type="dxa" w:w="2592"/>
+          </w:tcPr>
+          <w:p>
+            <w:r>
+              <w:rPr>
+                <w:sz w:val="18"/>
+              </w:rPr>
+              <w:t>IG = 1.0 - (4/8*1.0+4/8*1.0) = 0.0</w:t>
+            </w:r>
+          </w:p>
+        </w:tc>
+      </w:tr>
+      <w:tr>
+        <w:tc>
+          <w:tcPr>
+            <w:tcW w:type="dxa" w:w="1584"/>
+          </w:tcPr>
+          <w:p>
+            <w:r>
+              <w:rPr>
+                <w:sz w:val="18"/>
+              </w:rPr>
+              <w:t>Study Hours</w:t>
+            </w:r>
+          </w:p>
+        </w:tc>
+        <w:tc>
+          <w:tcPr>
+            <w:tcW w:type="dxa" w:w="3456"/>
+          </w:tcPr>
+          <w:p>
+            <w:r>
+              <w:rPr>
+                <w:sz w:val="18"/>
+              </w:rPr>
+              <w:t>Low: {1,2,4}=0Y3N; High: {5,6,7}=3Y0N; Med: {3,8}=1Y1N</w:t>
+            </w:r>
+          </w:p>
+        </w:tc>
+        <w:tc>
+          <w:tcPr>
+            <w:tcW w:type="dxa" w:w="1872"/>
+          </w:tcPr>
+          <w:p>
+            <w:r>
+              <w:rPr>
+                <w:sz w:val="18"/>
+              </w:rPr>
+              <w:t>H=0; H=0; H=1.0</w:t>
+            </w:r>
+          </w:p>
+        </w:tc>
+        <w:tc>
+          <w:tcPr>
+            <w:tcW w:type="dxa" w:w="2592"/>
+          </w:tcPr>
+          <w:p>
+            <w:r>
+              <w:rPr>
+                <w:sz w:val="18"/>
+              </w:rPr>
+              <w:t>IG = 1.0 - (3/8*0+3/8*0+2/8*1.0) = 0.75</w:t>
+            </w:r>
+          </w:p>
+        </w:tc>
+      </w:tr>
+      <w:tr>
+        <w:tc>
+          <w:tcPr>
+            <w:tcW w:type="dxa" w:w="1584"/>
+          </w:tcPr>
+          <w:p>
+            <w:r>
+              <w:rPr>
+                <w:sz w:val="18"/>
+              </w:rPr>
+              <w:t>Attendance</w:t>
+            </w:r>
+          </w:p>
+        </w:tc>
+        <w:tc>
+          <w:tcPr>
+            <w:tcW w:type="dxa" w:w="3456"/>
+          </w:tcPr>
+          <w:p>
+            <w:r>
+              <w:rPr>
+                <w:sz w:val="18"/>
+              </w:rPr>
+              <w:t>I: {1,3,4,6}=1Y3N; R: {2,5,7,8}=3Y1N</w:t>
+            </w:r>
+          </w:p>
+        </w:tc>
+        <w:tc>
+          <w:tcPr>
+            <w:tcW w:type="dxa" w:w="1872"/>
+          </w:tcPr>
+          <w:p>
+            <w:r>
+              <w:rPr>
+                <w:sz w:val="18"/>
+              </w:rPr>
+              <w:t>H=0.811 each</w:t>
+            </w:r>
+          </w:p>
+        </w:tc>
+        <w:tc>
+          <w:tcPr>
+            <w:tcW w:type="dxa" w:w="2592"/>
+          </w:tcPr>
+          <w:p>
+            <w:r>
+              <w:rPr>
+                <w:sz w:val="18"/>
+              </w:rPr>
+              <w:t>IG = 1.0 - (4/8*0.811+4/8*0.811) = 0.189</w:t>
+            </w:r>
+          </w:p>
+        </w:tc>
+      </w:tr>
+    </w:tbl>
+    <w:p>
+      <w:pPr>
+        <w:spacing w:after="0"/>
+      </w:pPr>
+    </w:p>
+    <w:p>
+      <w:pPr>
+        <w:spacing w:after="40"/>
+        <w:ind w:left="240"/>
+      </w:pPr>
+      <w:r>
+        <w:rPr>
+          <w:b w:val="0"/>
+          <w:sz w:val="20"/>
+        </w:rPr>
+        <w:t>Step 2 — Root node: Study Hours (highest IG = 0.75)</w:t>
+      </w:r>
+    </w:p>
+    <w:p>
+      <w:pPr>
+        <w:spacing w:after="40"/>
+        <w:ind w:left="240"/>
+      </w:pPr>
+      <w:r>
+        <w:rPr>
+          <w:b w:val="0"/>
+          <w:sz w:val="20"/>
+        </w:rPr>
+        <w:t>Step 3 — Branch Low → pure No → LEAF: Predict No</w:t>
+      </w:r>
+    </w:p>
+    <w:p>
+      <w:pPr>
+        <w:spacing w:after="40"/>
+        <w:ind w:left="240"/>
+      </w:pPr>
+      <w:r>
+        <w:rPr>
+          <w:b w:val="0"/>
+          <w:sz w:val="20"/>
+        </w:rPr>
+        <w:t>Step 4 — Branch High → pure Yes → LEAF: Predict Yes</w:t>
+      </w:r>
+    </w:p>
+    <w:p>
+      <w:pPr>
+        <w:spacing w:after="40"/>
+        <w:ind w:left="240"/>
+      </w:pPr>
+      <w:r>
+        <w:rPr>
+          <w:b w:val="0"/>
+          <w:sz w:val="20"/>
+        </w:rPr>
+        <w:t>Step 5 — Branch Medium: remaining {ID3, ID8}. Check Attendance:</w:t>
+      </w:r>
+    </w:p>
+    <w:p>
+      <w:pPr>
+        <w:spacing w:after="40"/>
+        <w:ind w:left="240"/>
+      </w:pPr>
+      <w:r>
+        <w:rPr>
+          <w:b w:val="0"/>
+          <w:sz w:val="20"/>
+        </w:rPr>
+        <w:t xml:space="preserve">         I (ID3, No) → LEAF: Predict No    |    R (ID8, Yes) → LEAF: Predict Yes</w:t>
+      </w:r>
+    </w:p>
+    <w:p>
+      <w:pPr>
+        <w:spacing w:after="40"/>
+        <w:ind w:left="320"/>
+      </w:pPr>
+      <w:r>
+        <w:rPr>
+          <w:rFonts w:ascii="Courier New" w:hAnsi="Courier New"/>
+          <w:b/>
+          <w:sz w:val="20"/>
+        </w:rPr>
+        <w:t>FINAL TREE: Root=Study Hours  →  Low→No  |  High→Yes  |  Medium→Attendance→{I→No, R→Yes}</w:t>
+      </w:r>
+    </w:p>
+    <w:p>
+      <w:pPr>
+        <w:spacing w:after="40"/>
+        <w:ind w:left="240"/>
+      </w:pPr>
+      <w:r>
+        <w:rPr>
+          <w:b/>
+          <w:color w:val="C05500"/>
+          <w:sz w:val="20"/>
+        </w:rPr>
+        <w:t xml:space="preserve">EXAM TIP: </w:t>
+      </w:r>
+      <w:r>
+        <w:rPr>
+          <w:color w:val="C05500"/>
+          <w:sz w:val="20"/>
+        </w:rPr>
+        <w:t>Study Years gives IG=0.0 — splitting on it provides zero additional information. Always compute IG for ALL features before choosing the root.</w:t>
       </w:r>
     </w:p>
     <w:p>
@@ -7465,6 +9516,1656 @@
           <w:sz w:val="20"/>
         </w:rPr>
         <w:t>From C, D is directly reachable (cost 8). From E, D costs 4+6=10 &gt; 8, so keep original D(g=8). Then D-&gt;G=16.</w:t>
+      </w:r>
+    </w:p>
+    <w:p>
+      <w:pPr>
+        <w:spacing w:after="0"/>
+      </w:pPr>
+    </w:p>
+    <w:p>
+      <w:pPr>
+        <w:pStyle w:val="Heading3"/>
+      </w:pPr>
+      <w:r>
+        <w:t>Q4 — K-Means Clustering (k=3, 10 data points) [12 marks]</w:t>
+      </w:r>
+    </w:p>
+    <w:p>
+      <w:pPr>
+        <w:spacing w:after="40"/>
+        <w:ind w:left="240"/>
+      </w:pPr>
+      <w:r>
+        <w:rPr>
+          <w:b w:val="0"/>
+          <w:sz w:val="20"/>
+        </w:rPr>
+        <w:t>Data points: 0.12, 0.15, 0.21, 0.50, 0.69, 0.78, 0.89, 1.25, 1.46, 1.97</w:t>
+      </w:r>
+    </w:p>
+    <w:p>
+      <w:pPr>
+        <w:spacing w:after="40"/>
+        <w:ind w:left="240"/>
+      </w:pPr>
+      <w:r>
+        <w:rPr>
+          <w:b w:val="0"/>
+          <w:sz w:val="20"/>
+        </w:rPr>
+        <w:t>Initial centroids: μ1=0.12, μ2=0.78, μ3=1.97  (first, middle, last)</w:t>
+      </w:r>
+    </w:p>
+    <w:tbl>
+      <w:tblPr>
+        <w:tblStyle w:val="TableGrid"/>
+        <w:tblW w:type="auto" w:w="0"/>
+        <w:tblLook w:firstColumn="1" w:firstRow="1" w:lastColumn="0" w:lastRow="0" w:noHBand="0" w:noVBand="1" w:val="04A0"/>
+      </w:tblPr>
+      <w:tblGrid>
+        <w:gridCol w:w="1994"/>
+        <w:gridCol w:w="1994"/>
+        <w:gridCol w:w="1994"/>
+        <w:gridCol w:w="1994"/>
+        <w:gridCol w:w="1994"/>
+      </w:tblGrid>
+      <w:tr>
+        <w:tc>
+          <w:tcPr>
+            <w:tcW w:type="dxa" w:w="864"/>
+            <w:shd w:fill="D6E4F0" w:val="clear"/>
+          </w:tcPr>
+          <w:p>
+            <w:r>
+              <w:rPr>
+                <w:b/>
+                <w:sz w:val="18"/>
+              </w:rPr>
+              <w:t>Point</w:t>
+            </w:r>
+          </w:p>
+        </w:tc>
+        <w:tc>
+          <w:tcPr>
+            <w:tcW w:type="dxa" w:w="2016"/>
+            <w:shd w:fill="D6E4F0" w:val="clear"/>
+          </w:tcPr>
+          <w:p>
+            <w:r>
+              <w:rPr>
+                <w:b/>
+                <w:sz w:val="18"/>
+              </w:rPr>
+              <w:t>Dist to μ1=0.12</w:t>
+            </w:r>
+          </w:p>
+        </w:tc>
+        <w:tc>
+          <w:tcPr>
+            <w:tcW w:type="dxa" w:w="2016"/>
+            <w:shd w:fill="D6E4F0" w:val="clear"/>
+          </w:tcPr>
+          <w:p>
+            <w:r>
+              <w:rPr>
+                <w:b/>
+                <w:sz w:val="18"/>
+              </w:rPr>
+              <w:t>Dist to μ2=0.78</w:t>
+            </w:r>
+          </w:p>
+        </w:tc>
+        <w:tc>
+          <w:tcPr>
+            <w:tcW w:type="dxa" w:w="2016"/>
+            <w:shd w:fill="D6E4F0" w:val="clear"/>
+          </w:tcPr>
+          <w:p>
+            <w:r>
+              <w:rPr>
+                <w:b/>
+                <w:sz w:val="18"/>
+              </w:rPr>
+              <w:t>Dist to μ3=1.97</w:t>
+            </w:r>
+          </w:p>
+        </w:tc>
+        <w:tc>
+          <w:tcPr>
+            <w:tcW w:type="dxa" w:w="1440"/>
+            <w:shd w:fill="D6E4F0" w:val="clear"/>
+          </w:tcPr>
+          <w:p>
+            <w:r>
+              <w:rPr>
+                <w:b/>
+                <w:sz w:val="18"/>
+              </w:rPr>
+              <w:t>Cluster (Iter 1)</w:t>
+            </w:r>
+          </w:p>
+        </w:tc>
+      </w:tr>
+      <w:tr>
+        <w:tc>
+          <w:tcPr>
+            <w:tcW w:type="dxa" w:w="864"/>
+          </w:tcPr>
+          <w:p>
+            <w:r>
+              <w:rPr>
+                <w:sz w:val="18"/>
+              </w:rPr>
+              <w:t>0.12</w:t>
+            </w:r>
+          </w:p>
+        </w:tc>
+        <w:tc>
+          <w:tcPr>
+            <w:tcW w:type="dxa" w:w="2016"/>
+          </w:tcPr>
+          <w:p>
+            <w:r>
+              <w:rPr>
+                <w:sz w:val="18"/>
+              </w:rPr>
+              <w:t>0.00</w:t>
+            </w:r>
+          </w:p>
+        </w:tc>
+        <w:tc>
+          <w:tcPr>
+            <w:tcW w:type="dxa" w:w="2016"/>
+          </w:tcPr>
+          <w:p>
+            <w:r>
+              <w:rPr>
+                <w:sz w:val="18"/>
+              </w:rPr>
+              <w:t>0.66</w:t>
+            </w:r>
+          </w:p>
+        </w:tc>
+        <w:tc>
+          <w:tcPr>
+            <w:tcW w:type="dxa" w:w="2016"/>
+          </w:tcPr>
+          <w:p>
+            <w:r>
+              <w:rPr>
+                <w:sz w:val="18"/>
+              </w:rPr>
+              <w:t>1.85</w:t>
+            </w:r>
+          </w:p>
+        </w:tc>
+        <w:tc>
+          <w:tcPr>
+            <w:tcW w:type="dxa" w:w="1440"/>
+          </w:tcPr>
+          <w:p>
+            <w:r>
+              <w:rPr>
+                <w:sz w:val="18"/>
+              </w:rPr>
+              <w:t>C1</w:t>
+            </w:r>
+          </w:p>
+        </w:tc>
+      </w:tr>
+      <w:tr>
+        <w:tc>
+          <w:tcPr>
+            <w:tcW w:type="dxa" w:w="864"/>
+          </w:tcPr>
+          <w:p>
+            <w:r>
+              <w:rPr>
+                <w:sz w:val="18"/>
+              </w:rPr>
+              <w:t>0.15</w:t>
+            </w:r>
+          </w:p>
+        </w:tc>
+        <w:tc>
+          <w:tcPr>
+            <w:tcW w:type="dxa" w:w="2016"/>
+          </w:tcPr>
+          <w:p>
+            <w:r>
+              <w:rPr>
+                <w:sz w:val="18"/>
+              </w:rPr>
+              <w:t>0.03</w:t>
+            </w:r>
+          </w:p>
+        </w:tc>
+        <w:tc>
+          <w:tcPr>
+            <w:tcW w:type="dxa" w:w="2016"/>
+          </w:tcPr>
+          <w:p>
+            <w:r>
+              <w:rPr>
+                <w:sz w:val="18"/>
+              </w:rPr>
+              <w:t>0.63</w:t>
+            </w:r>
+          </w:p>
+        </w:tc>
+        <w:tc>
+          <w:tcPr>
+            <w:tcW w:type="dxa" w:w="2016"/>
+          </w:tcPr>
+          <w:p>
+            <w:r>
+              <w:rPr>
+                <w:sz w:val="18"/>
+              </w:rPr>
+              <w:t>1.82</w:t>
+            </w:r>
+          </w:p>
+        </w:tc>
+        <w:tc>
+          <w:tcPr>
+            <w:tcW w:type="dxa" w:w="1440"/>
+          </w:tcPr>
+          <w:p>
+            <w:r>
+              <w:rPr>
+                <w:sz w:val="18"/>
+              </w:rPr>
+              <w:t>C1</w:t>
+            </w:r>
+          </w:p>
+        </w:tc>
+      </w:tr>
+      <w:tr>
+        <w:tc>
+          <w:tcPr>
+            <w:tcW w:type="dxa" w:w="864"/>
+          </w:tcPr>
+          <w:p>
+            <w:r>
+              <w:rPr>
+                <w:sz w:val="18"/>
+              </w:rPr>
+              <w:t>0.21</w:t>
+            </w:r>
+          </w:p>
+        </w:tc>
+        <w:tc>
+          <w:tcPr>
+            <w:tcW w:type="dxa" w:w="2016"/>
+          </w:tcPr>
+          <w:p>
+            <w:r>
+              <w:rPr>
+                <w:sz w:val="18"/>
+              </w:rPr>
+              <w:t>0.09</w:t>
+            </w:r>
+          </w:p>
+        </w:tc>
+        <w:tc>
+          <w:tcPr>
+            <w:tcW w:type="dxa" w:w="2016"/>
+          </w:tcPr>
+          <w:p>
+            <w:r>
+              <w:rPr>
+                <w:sz w:val="18"/>
+              </w:rPr>
+              <w:t>0.57</w:t>
+            </w:r>
+          </w:p>
+        </w:tc>
+        <w:tc>
+          <w:tcPr>
+            <w:tcW w:type="dxa" w:w="2016"/>
+          </w:tcPr>
+          <w:p>
+            <w:r>
+              <w:rPr>
+                <w:sz w:val="18"/>
+              </w:rPr>
+              <w:t>1.76</w:t>
+            </w:r>
+          </w:p>
+        </w:tc>
+        <w:tc>
+          <w:tcPr>
+            <w:tcW w:type="dxa" w:w="1440"/>
+          </w:tcPr>
+          <w:p>
+            <w:r>
+              <w:rPr>
+                <w:sz w:val="18"/>
+              </w:rPr>
+              <w:t>C1</w:t>
+            </w:r>
+          </w:p>
+        </w:tc>
+      </w:tr>
+      <w:tr>
+        <w:tc>
+          <w:tcPr>
+            <w:tcW w:type="dxa" w:w="864"/>
+          </w:tcPr>
+          <w:p>
+            <w:r>
+              <w:rPr>
+                <w:sz w:val="18"/>
+              </w:rPr>
+              <w:t>0.50</w:t>
+            </w:r>
+          </w:p>
+        </w:tc>
+        <w:tc>
+          <w:tcPr>
+            <w:tcW w:type="dxa" w:w="2016"/>
+          </w:tcPr>
+          <w:p>
+            <w:r>
+              <w:rPr>
+                <w:sz w:val="18"/>
+              </w:rPr>
+              <w:t>0.38</w:t>
+            </w:r>
+          </w:p>
+        </w:tc>
+        <w:tc>
+          <w:tcPr>
+            <w:tcW w:type="dxa" w:w="2016"/>
+          </w:tcPr>
+          <w:p>
+            <w:r>
+              <w:rPr>
+                <w:sz w:val="18"/>
+              </w:rPr>
+              <w:t>0.28</w:t>
+            </w:r>
+          </w:p>
+        </w:tc>
+        <w:tc>
+          <w:tcPr>
+            <w:tcW w:type="dxa" w:w="2016"/>
+          </w:tcPr>
+          <w:p>
+            <w:r>
+              <w:rPr>
+                <w:sz w:val="18"/>
+              </w:rPr>
+              <w:t>1.47</w:t>
+            </w:r>
+          </w:p>
+        </w:tc>
+        <w:tc>
+          <w:tcPr>
+            <w:tcW w:type="dxa" w:w="1440"/>
+          </w:tcPr>
+          <w:p>
+            <w:r>
+              <w:rPr>
+                <w:sz w:val="18"/>
+              </w:rPr>
+              <w:t>C2</w:t>
+            </w:r>
+          </w:p>
+        </w:tc>
+      </w:tr>
+      <w:tr>
+        <w:tc>
+          <w:tcPr>
+            <w:tcW w:type="dxa" w:w="864"/>
+          </w:tcPr>
+          <w:p>
+            <w:r>
+              <w:rPr>
+                <w:sz w:val="18"/>
+              </w:rPr>
+              <w:t>0.69</w:t>
+            </w:r>
+          </w:p>
+        </w:tc>
+        <w:tc>
+          <w:tcPr>
+            <w:tcW w:type="dxa" w:w="2016"/>
+          </w:tcPr>
+          <w:p>
+            <w:r>
+              <w:rPr>
+                <w:sz w:val="18"/>
+              </w:rPr>
+              <w:t>0.57</w:t>
+            </w:r>
+          </w:p>
+        </w:tc>
+        <w:tc>
+          <w:tcPr>
+            <w:tcW w:type="dxa" w:w="2016"/>
+          </w:tcPr>
+          <w:p>
+            <w:r>
+              <w:rPr>
+                <w:sz w:val="18"/>
+              </w:rPr>
+              <w:t>0.09</w:t>
+            </w:r>
+          </w:p>
+        </w:tc>
+        <w:tc>
+          <w:tcPr>
+            <w:tcW w:type="dxa" w:w="2016"/>
+          </w:tcPr>
+          <w:p>
+            <w:r>
+              <w:rPr>
+                <w:sz w:val="18"/>
+              </w:rPr>
+              <w:t>1.28</w:t>
+            </w:r>
+          </w:p>
+        </w:tc>
+        <w:tc>
+          <w:tcPr>
+            <w:tcW w:type="dxa" w:w="1440"/>
+          </w:tcPr>
+          <w:p>
+            <w:r>
+              <w:rPr>
+                <w:sz w:val="18"/>
+              </w:rPr>
+              <w:t>C2</w:t>
+            </w:r>
+          </w:p>
+        </w:tc>
+      </w:tr>
+      <w:tr>
+        <w:tc>
+          <w:tcPr>
+            <w:tcW w:type="dxa" w:w="864"/>
+          </w:tcPr>
+          <w:p>
+            <w:r>
+              <w:rPr>
+                <w:sz w:val="18"/>
+              </w:rPr>
+              <w:t>0.78</w:t>
+            </w:r>
+          </w:p>
+        </w:tc>
+        <w:tc>
+          <w:tcPr>
+            <w:tcW w:type="dxa" w:w="2016"/>
+          </w:tcPr>
+          <w:p>
+            <w:r>
+              <w:rPr>
+                <w:sz w:val="18"/>
+              </w:rPr>
+              <w:t>0.66</w:t>
+            </w:r>
+          </w:p>
+        </w:tc>
+        <w:tc>
+          <w:tcPr>
+            <w:tcW w:type="dxa" w:w="2016"/>
+          </w:tcPr>
+          <w:p>
+            <w:r>
+              <w:rPr>
+                <w:sz w:val="18"/>
+              </w:rPr>
+              <w:t>0.00</w:t>
+            </w:r>
+          </w:p>
+        </w:tc>
+        <w:tc>
+          <w:tcPr>
+            <w:tcW w:type="dxa" w:w="2016"/>
+          </w:tcPr>
+          <w:p>
+            <w:r>
+              <w:rPr>
+                <w:sz w:val="18"/>
+              </w:rPr>
+              <w:t>1.19</w:t>
+            </w:r>
+          </w:p>
+        </w:tc>
+        <w:tc>
+          <w:tcPr>
+            <w:tcW w:type="dxa" w:w="1440"/>
+          </w:tcPr>
+          <w:p>
+            <w:r>
+              <w:rPr>
+                <w:sz w:val="18"/>
+              </w:rPr>
+              <w:t>C2</w:t>
+            </w:r>
+          </w:p>
+        </w:tc>
+      </w:tr>
+      <w:tr>
+        <w:tc>
+          <w:tcPr>
+            <w:tcW w:type="dxa" w:w="864"/>
+          </w:tcPr>
+          <w:p>
+            <w:r>
+              <w:rPr>
+                <w:sz w:val="18"/>
+              </w:rPr>
+              <w:t>0.89</w:t>
+            </w:r>
+          </w:p>
+        </w:tc>
+        <w:tc>
+          <w:tcPr>
+            <w:tcW w:type="dxa" w:w="2016"/>
+          </w:tcPr>
+          <w:p>
+            <w:r>
+              <w:rPr>
+                <w:sz w:val="18"/>
+              </w:rPr>
+              <w:t>0.77</w:t>
+            </w:r>
+          </w:p>
+        </w:tc>
+        <w:tc>
+          <w:tcPr>
+            <w:tcW w:type="dxa" w:w="2016"/>
+          </w:tcPr>
+          <w:p>
+            <w:r>
+              <w:rPr>
+                <w:sz w:val="18"/>
+              </w:rPr>
+              <w:t>0.11</w:t>
+            </w:r>
+          </w:p>
+        </w:tc>
+        <w:tc>
+          <w:tcPr>
+            <w:tcW w:type="dxa" w:w="2016"/>
+          </w:tcPr>
+          <w:p>
+            <w:r>
+              <w:rPr>
+                <w:sz w:val="18"/>
+              </w:rPr>
+              <w:t>1.08</w:t>
+            </w:r>
+          </w:p>
+        </w:tc>
+        <w:tc>
+          <w:tcPr>
+            <w:tcW w:type="dxa" w:w="1440"/>
+          </w:tcPr>
+          <w:p>
+            <w:r>
+              <w:rPr>
+                <w:sz w:val="18"/>
+              </w:rPr>
+              <w:t>C2</w:t>
+            </w:r>
+          </w:p>
+        </w:tc>
+      </w:tr>
+      <w:tr>
+        <w:tc>
+          <w:tcPr>
+            <w:tcW w:type="dxa" w:w="864"/>
+          </w:tcPr>
+          <w:p>
+            <w:r>
+              <w:rPr>
+                <w:sz w:val="18"/>
+              </w:rPr>
+              <w:t>1.25</w:t>
+            </w:r>
+          </w:p>
+        </w:tc>
+        <w:tc>
+          <w:tcPr>
+            <w:tcW w:type="dxa" w:w="2016"/>
+          </w:tcPr>
+          <w:p>
+            <w:r>
+              <w:rPr>
+                <w:sz w:val="18"/>
+              </w:rPr>
+              <w:t>1.13</w:t>
+            </w:r>
+          </w:p>
+        </w:tc>
+        <w:tc>
+          <w:tcPr>
+            <w:tcW w:type="dxa" w:w="2016"/>
+          </w:tcPr>
+          <w:p>
+            <w:r>
+              <w:rPr>
+                <w:sz w:val="18"/>
+              </w:rPr>
+              <w:t>0.47</w:t>
+            </w:r>
+          </w:p>
+        </w:tc>
+        <w:tc>
+          <w:tcPr>
+            <w:tcW w:type="dxa" w:w="2016"/>
+          </w:tcPr>
+          <w:p>
+            <w:r>
+              <w:rPr>
+                <w:sz w:val="18"/>
+              </w:rPr>
+              <w:t>0.72</w:t>
+            </w:r>
+          </w:p>
+        </w:tc>
+        <w:tc>
+          <w:tcPr>
+            <w:tcW w:type="dxa" w:w="1440"/>
+          </w:tcPr>
+          <w:p>
+            <w:r>
+              <w:rPr>
+                <w:sz w:val="18"/>
+              </w:rPr>
+              <w:t>C3</w:t>
+            </w:r>
+          </w:p>
+        </w:tc>
+      </w:tr>
+      <w:tr>
+        <w:tc>
+          <w:tcPr>
+            <w:tcW w:type="dxa" w:w="864"/>
+          </w:tcPr>
+          <w:p>
+            <w:r>
+              <w:rPr>
+                <w:sz w:val="18"/>
+              </w:rPr>
+              <w:t>1.46</w:t>
+            </w:r>
+          </w:p>
+        </w:tc>
+        <w:tc>
+          <w:tcPr>
+            <w:tcW w:type="dxa" w:w="2016"/>
+          </w:tcPr>
+          <w:p>
+            <w:r>
+              <w:rPr>
+                <w:sz w:val="18"/>
+              </w:rPr>
+              <w:t>1.34</w:t>
+            </w:r>
+          </w:p>
+        </w:tc>
+        <w:tc>
+          <w:tcPr>
+            <w:tcW w:type="dxa" w:w="2016"/>
+          </w:tcPr>
+          <w:p>
+            <w:r>
+              <w:rPr>
+                <w:sz w:val="18"/>
+              </w:rPr>
+              <w:t>0.68</w:t>
+            </w:r>
+          </w:p>
+        </w:tc>
+        <w:tc>
+          <w:tcPr>
+            <w:tcW w:type="dxa" w:w="2016"/>
+          </w:tcPr>
+          <w:p>
+            <w:r>
+              <w:rPr>
+                <w:sz w:val="18"/>
+              </w:rPr>
+              <w:t>0.51</w:t>
+            </w:r>
+          </w:p>
+        </w:tc>
+        <w:tc>
+          <w:tcPr>
+            <w:tcW w:type="dxa" w:w="1440"/>
+          </w:tcPr>
+          <w:p>
+            <w:r>
+              <w:rPr>
+                <w:sz w:val="18"/>
+              </w:rPr>
+              <w:t>C3</w:t>
+            </w:r>
+          </w:p>
+        </w:tc>
+      </w:tr>
+      <w:tr>
+        <w:tc>
+          <w:tcPr>
+            <w:tcW w:type="dxa" w:w="864"/>
+          </w:tcPr>
+          <w:p>
+            <w:r>
+              <w:rPr>
+                <w:sz w:val="18"/>
+              </w:rPr>
+              <w:t>1.97</w:t>
+            </w:r>
+          </w:p>
+        </w:tc>
+        <w:tc>
+          <w:tcPr>
+            <w:tcW w:type="dxa" w:w="2016"/>
+          </w:tcPr>
+          <w:p>
+            <w:r>
+              <w:rPr>
+                <w:sz w:val="18"/>
+              </w:rPr>
+              <w:t>1.85</w:t>
+            </w:r>
+          </w:p>
+        </w:tc>
+        <w:tc>
+          <w:tcPr>
+            <w:tcW w:type="dxa" w:w="2016"/>
+          </w:tcPr>
+          <w:p>
+            <w:r>
+              <w:rPr>
+                <w:sz w:val="18"/>
+              </w:rPr>
+              <w:t>1.19</w:t>
+            </w:r>
+          </w:p>
+        </w:tc>
+        <w:tc>
+          <w:tcPr>
+            <w:tcW w:type="dxa" w:w="2016"/>
+          </w:tcPr>
+          <w:p>
+            <w:r>
+              <w:rPr>
+                <w:sz w:val="18"/>
+              </w:rPr>
+              <w:t>0.00</w:t>
+            </w:r>
+          </w:p>
+        </w:tc>
+        <w:tc>
+          <w:tcPr>
+            <w:tcW w:type="dxa" w:w="1440"/>
+          </w:tcPr>
+          <w:p>
+            <w:r>
+              <w:rPr>
+                <w:sz w:val="18"/>
+              </w:rPr>
+              <w:t>C3</w:t>
+            </w:r>
+          </w:p>
+        </w:tc>
+      </w:tr>
+    </w:tbl>
+    <w:p>
+      <w:pPr>
+        <w:spacing w:after="0"/>
+      </w:pPr>
+    </w:p>
+    <w:p>
+      <w:pPr>
+        <w:spacing w:after="40"/>
+        <w:ind w:left="240"/>
+      </w:pPr>
+      <w:r>
+        <w:rPr>
+          <w:b w:val="0"/>
+          <w:sz w:val="20"/>
+        </w:rPr>
+        <w:t>After Iteration 1: C1={0.12,0.15,0.21}, C2={0.50,0.69,0.78,0.89}, C3={1.25,1.46,1.97}</w:t>
+      </w:r>
+    </w:p>
+    <w:p>
+      <w:pPr>
+        <w:spacing w:after="40"/>
+        <w:ind w:left="320"/>
+      </w:pPr>
+      <w:r>
+        <w:rPr>
+          <w:rFonts w:ascii="Courier New" w:hAnsi="Courier New"/>
+          <w:b/>
+          <w:sz w:val="20"/>
+        </w:rPr>
+        <w:t>New centroids: μ1=(0.12+0.15+0.21)/3=0.16   μ2=(0.50+0.69+0.78+0.89)/4=0.715   μ3=(1.25+1.46+1.97)/3=1.56</w:t>
+      </w:r>
+    </w:p>
+    <w:tbl>
+      <w:tblPr>
+        <w:tblStyle w:val="TableGrid"/>
+        <w:tblW w:type="auto" w:w="0"/>
+        <w:tblLook w:firstColumn="1" w:firstRow="1" w:lastColumn="0" w:lastRow="0" w:noHBand="0" w:noVBand="1" w:val="04A0"/>
+      </w:tblPr>
+      <w:tblGrid>
+        <w:gridCol w:w="1994"/>
+        <w:gridCol w:w="1994"/>
+        <w:gridCol w:w="1994"/>
+        <w:gridCol w:w="1994"/>
+        <w:gridCol w:w="1994"/>
+      </w:tblGrid>
+      <w:tr>
+        <w:tc>
+          <w:tcPr>
+            <w:tcW w:type="dxa" w:w="864"/>
+            <w:shd w:fill="D6E4F0" w:val="clear"/>
+          </w:tcPr>
+          <w:p>
+            <w:r>
+              <w:rPr>
+                <w:b/>
+                <w:sz w:val="18"/>
+              </w:rPr>
+              <w:t>Point</w:t>
+            </w:r>
+          </w:p>
+        </w:tc>
+        <w:tc>
+          <w:tcPr>
+            <w:tcW w:type="dxa" w:w="2016"/>
+            <w:shd w:fill="D6E4F0" w:val="clear"/>
+          </w:tcPr>
+          <w:p>
+            <w:r>
+              <w:rPr>
+                <w:b/>
+                <w:sz w:val="18"/>
+              </w:rPr>
+              <w:t>Dist to μ1=0.16</w:t>
+            </w:r>
+          </w:p>
+        </w:tc>
+        <w:tc>
+          <w:tcPr>
+            <w:tcW w:type="dxa" w:w="2088"/>
+            <w:shd w:fill="D6E4F0" w:val="clear"/>
+          </w:tcPr>
+          <w:p>
+            <w:r>
+              <w:rPr>
+                <w:b/>
+                <w:sz w:val="18"/>
+              </w:rPr>
+              <w:t>Dist to μ2=0.715</w:t>
+            </w:r>
+          </w:p>
+        </w:tc>
+        <w:tc>
+          <w:tcPr>
+            <w:tcW w:type="dxa" w:w="2088"/>
+            <w:shd w:fill="D6E4F0" w:val="clear"/>
+          </w:tcPr>
+          <w:p>
+            <w:r>
+              <w:rPr>
+                <w:b/>
+                <w:sz w:val="18"/>
+              </w:rPr>
+              <w:t>Dist to μ3=1.56</w:t>
+            </w:r>
+          </w:p>
+        </w:tc>
+        <w:tc>
+          <w:tcPr>
+            <w:tcW w:type="dxa" w:w="1440"/>
+            <w:shd w:fill="D6E4F0" w:val="clear"/>
+          </w:tcPr>
+          <w:p>
+            <w:r>
+              <w:rPr>
+                <w:b/>
+                <w:sz w:val="18"/>
+              </w:rPr>
+              <w:t>Cluster (Iter 2)</w:t>
+            </w:r>
+          </w:p>
+        </w:tc>
+      </w:tr>
+      <w:tr>
+        <w:tc>
+          <w:tcPr>
+            <w:tcW w:type="dxa" w:w="864"/>
+          </w:tcPr>
+          <w:p>
+            <w:r>
+              <w:rPr>
+                <w:sz w:val="18"/>
+              </w:rPr>
+              <w:t>0.12</w:t>
+            </w:r>
+          </w:p>
+        </w:tc>
+        <w:tc>
+          <w:tcPr>
+            <w:tcW w:type="dxa" w:w="2016"/>
+          </w:tcPr>
+          <w:p>
+            <w:r>
+              <w:rPr>
+                <w:sz w:val="18"/>
+              </w:rPr>
+              <w:t>0.04</w:t>
+            </w:r>
+          </w:p>
+        </w:tc>
+        <w:tc>
+          <w:tcPr>
+            <w:tcW w:type="dxa" w:w="2088"/>
+          </w:tcPr>
+          <w:p>
+            <w:r>
+              <w:rPr>
+                <w:sz w:val="18"/>
+              </w:rPr>
+              <w:t>0.595</w:t>
+            </w:r>
+          </w:p>
+        </w:tc>
+        <w:tc>
+          <w:tcPr>
+            <w:tcW w:type="dxa" w:w="2088"/>
+          </w:tcPr>
+          <w:p>
+            <w:r>
+              <w:rPr>
+                <w:sz w:val="18"/>
+              </w:rPr>
+              <w:t>1.44</w:t>
+            </w:r>
+          </w:p>
+        </w:tc>
+        <w:tc>
+          <w:tcPr>
+            <w:tcW w:type="dxa" w:w="1440"/>
+          </w:tcPr>
+          <w:p>
+            <w:r>
+              <w:rPr>
+                <w:sz w:val="18"/>
+              </w:rPr>
+              <w:t>C1</w:t>
+            </w:r>
+          </w:p>
+        </w:tc>
+      </w:tr>
+      <w:tr>
+        <w:tc>
+          <w:tcPr>
+            <w:tcW w:type="dxa" w:w="864"/>
+          </w:tcPr>
+          <w:p>
+            <w:r>
+              <w:rPr>
+                <w:sz w:val="18"/>
+              </w:rPr>
+              <w:t>0.15</w:t>
+            </w:r>
+          </w:p>
+        </w:tc>
+        <w:tc>
+          <w:tcPr>
+            <w:tcW w:type="dxa" w:w="2016"/>
+          </w:tcPr>
+          <w:p>
+            <w:r>
+              <w:rPr>
+                <w:sz w:val="18"/>
+              </w:rPr>
+              <w:t>0.01</w:t>
+            </w:r>
+          </w:p>
+        </w:tc>
+        <w:tc>
+          <w:tcPr>
+            <w:tcW w:type="dxa" w:w="2088"/>
+          </w:tcPr>
+          <w:p>
+            <w:r>
+              <w:rPr>
+                <w:sz w:val="18"/>
+              </w:rPr>
+              <w:t>0.565</w:t>
+            </w:r>
+          </w:p>
+        </w:tc>
+        <w:tc>
+          <w:tcPr>
+            <w:tcW w:type="dxa" w:w="2088"/>
+          </w:tcPr>
+          <w:p>
+            <w:r>
+              <w:rPr>
+                <w:sz w:val="18"/>
+              </w:rPr>
+              <w:t>1.41</w:t>
+            </w:r>
+          </w:p>
+        </w:tc>
+        <w:tc>
+          <w:tcPr>
+            <w:tcW w:type="dxa" w:w="1440"/>
+          </w:tcPr>
+          <w:p>
+            <w:r>
+              <w:rPr>
+                <w:sz w:val="18"/>
+              </w:rPr>
+              <w:t>C1</w:t>
+            </w:r>
+          </w:p>
+        </w:tc>
+      </w:tr>
+      <w:tr>
+        <w:tc>
+          <w:tcPr>
+            <w:tcW w:type="dxa" w:w="864"/>
+          </w:tcPr>
+          <w:p>
+            <w:r>
+              <w:rPr>
+                <w:sz w:val="18"/>
+              </w:rPr>
+              <w:t>0.21</w:t>
+            </w:r>
+          </w:p>
+        </w:tc>
+        <w:tc>
+          <w:tcPr>
+            <w:tcW w:type="dxa" w:w="2016"/>
+          </w:tcPr>
+          <w:p>
+            <w:r>
+              <w:rPr>
+                <w:sz w:val="18"/>
+              </w:rPr>
+              <w:t>0.05</w:t>
+            </w:r>
+          </w:p>
+        </w:tc>
+        <w:tc>
+          <w:tcPr>
+            <w:tcW w:type="dxa" w:w="2088"/>
+          </w:tcPr>
+          <w:p>
+            <w:r>
+              <w:rPr>
+                <w:sz w:val="18"/>
+              </w:rPr>
+              <w:t>0.505</w:t>
+            </w:r>
+          </w:p>
+        </w:tc>
+        <w:tc>
+          <w:tcPr>
+            <w:tcW w:type="dxa" w:w="2088"/>
+          </w:tcPr>
+          <w:p>
+            <w:r>
+              <w:rPr>
+                <w:sz w:val="18"/>
+              </w:rPr>
+              <w:t>1.35</w:t>
+            </w:r>
+          </w:p>
+        </w:tc>
+        <w:tc>
+          <w:tcPr>
+            <w:tcW w:type="dxa" w:w="1440"/>
+          </w:tcPr>
+          <w:p>
+            <w:r>
+              <w:rPr>
+                <w:sz w:val="18"/>
+              </w:rPr>
+              <w:t>C1</w:t>
+            </w:r>
+          </w:p>
+        </w:tc>
+      </w:tr>
+      <w:tr>
+        <w:tc>
+          <w:tcPr>
+            <w:tcW w:type="dxa" w:w="864"/>
+          </w:tcPr>
+          <w:p>
+            <w:r>
+              <w:rPr>
+                <w:sz w:val="18"/>
+              </w:rPr>
+              <w:t>0.50</w:t>
+            </w:r>
+          </w:p>
+        </w:tc>
+        <w:tc>
+          <w:tcPr>
+            <w:tcW w:type="dxa" w:w="2016"/>
+          </w:tcPr>
+          <w:p>
+            <w:r>
+              <w:rPr>
+                <w:sz w:val="18"/>
+              </w:rPr>
+              <w:t>0.34</w:t>
+            </w:r>
+          </w:p>
+        </w:tc>
+        <w:tc>
+          <w:tcPr>
+            <w:tcW w:type="dxa" w:w="2088"/>
+          </w:tcPr>
+          <w:p>
+            <w:r>
+              <w:rPr>
+                <w:sz w:val="18"/>
+              </w:rPr>
+              <w:t>0.215</w:t>
+            </w:r>
+          </w:p>
+        </w:tc>
+        <w:tc>
+          <w:tcPr>
+            <w:tcW w:type="dxa" w:w="2088"/>
+          </w:tcPr>
+          <w:p>
+            <w:r>
+              <w:rPr>
+                <w:sz w:val="18"/>
+              </w:rPr>
+              <w:t>1.06</w:t>
+            </w:r>
+          </w:p>
+        </w:tc>
+        <w:tc>
+          <w:tcPr>
+            <w:tcW w:type="dxa" w:w="1440"/>
+          </w:tcPr>
+          <w:p>
+            <w:r>
+              <w:rPr>
+                <w:sz w:val="18"/>
+              </w:rPr>
+              <w:t>C2</w:t>
+            </w:r>
+          </w:p>
+        </w:tc>
+      </w:tr>
+      <w:tr>
+        <w:tc>
+          <w:tcPr>
+            <w:tcW w:type="dxa" w:w="864"/>
+          </w:tcPr>
+          <w:p>
+            <w:r>
+              <w:rPr>
+                <w:sz w:val="18"/>
+              </w:rPr>
+              <w:t>0.69</w:t>
+            </w:r>
+          </w:p>
+        </w:tc>
+        <w:tc>
+          <w:tcPr>
+            <w:tcW w:type="dxa" w:w="2016"/>
+          </w:tcPr>
+          <w:p>
+            <w:r>
+              <w:rPr>
+                <w:sz w:val="18"/>
+              </w:rPr>
+              <w:t>0.53</w:t>
+            </w:r>
+          </w:p>
+        </w:tc>
+        <w:tc>
+          <w:tcPr>
+            <w:tcW w:type="dxa" w:w="2088"/>
+          </w:tcPr>
+          <w:p>
+            <w:r>
+              <w:rPr>
+                <w:sz w:val="18"/>
+              </w:rPr>
+              <w:t>0.025</w:t>
+            </w:r>
+          </w:p>
+        </w:tc>
+        <w:tc>
+          <w:tcPr>
+            <w:tcW w:type="dxa" w:w="2088"/>
+          </w:tcPr>
+          <w:p>
+            <w:r>
+              <w:rPr>
+                <w:sz w:val="18"/>
+              </w:rPr>
+              <w:t>0.87</w:t>
+            </w:r>
+          </w:p>
+        </w:tc>
+        <w:tc>
+          <w:tcPr>
+            <w:tcW w:type="dxa" w:w="1440"/>
+          </w:tcPr>
+          <w:p>
+            <w:r>
+              <w:rPr>
+                <w:sz w:val="18"/>
+              </w:rPr>
+              <w:t>C2</w:t>
+            </w:r>
+          </w:p>
+        </w:tc>
+      </w:tr>
+      <w:tr>
+        <w:tc>
+          <w:tcPr>
+            <w:tcW w:type="dxa" w:w="864"/>
+          </w:tcPr>
+          <w:p>
+            <w:r>
+              <w:rPr>
+                <w:sz w:val="18"/>
+              </w:rPr>
+              <w:t>0.78</w:t>
+            </w:r>
+          </w:p>
+        </w:tc>
+        <w:tc>
+          <w:tcPr>
+            <w:tcW w:type="dxa" w:w="2016"/>
+          </w:tcPr>
+          <w:p>
+            <w:r>
+              <w:rPr>
+                <w:sz w:val="18"/>
+              </w:rPr>
+              <w:t>0.62</w:t>
+            </w:r>
+          </w:p>
+        </w:tc>
+        <w:tc>
+          <w:tcPr>
+            <w:tcW w:type="dxa" w:w="2088"/>
+          </w:tcPr>
+          <w:p>
+            <w:r>
+              <w:rPr>
+                <w:sz w:val="18"/>
+              </w:rPr>
+              <w:t>0.065</w:t>
+            </w:r>
+          </w:p>
+        </w:tc>
+        <w:tc>
+          <w:tcPr>
+            <w:tcW w:type="dxa" w:w="2088"/>
+          </w:tcPr>
+          <w:p>
+            <w:r>
+              <w:rPr>
+                <w:sz w:val="18"/>
+              </w:rPr>
+              <w:t>0.78</w:t>
+            </w:r>
+          </w:p>
+        </w:tc>
+        <w:tc>
+          <w:tcPr>
+            <w:tcW w:type="dxa" w:w="1440"/>
+          </w:tcPr>
+          <w:p>
+            <w:r>
+              <w:rPr>
+                <w:sz w:val="18"/>
+              </w:rPr>
+              <w:t>C2</w:t>
+            </w:r>
+          </w:p>
+        </w:tc>
+      </w:tr>
+      <w:tr>
+        <w:tc>
+          <w:tcPr>
+            <w:tcW w:type="dxa" w:w="864"/>
+          </w:tcPr>
+          <w:p>
+            <w:r>
+              <w:rPr>
+                <w:sz w:val="18"/>
+              </w:rPr>
+              <w:t>0.89</w:t>
+            </w:r>
+          </w:p>
+        </w:tc>
+        <w:tc>
+          <w:tcPr>
+            <w:tcW w:type="dxa" w:w="2016"/>
+          </w:tcPr>
+          <w:p>
+            <w:r>
+              <w:rPr>
+                <w:sz w:val="18"/>
+              </w:rPr>
+              <w:t>0.73</w:t>
+            </w:r>
+          </w:p>
+        </w:tc>
+        <w:tc>
+          <w:tcPr>
+            <w:tcW w:type="dxa" w:w="2088"/>
+          </w:tcPr>
+          <w:p>
+            <w:r>
+              <w:rPr>
+                <w:sz w:val="18"/>
+              </w:rPr>
+              <w:t>0.175</w:t>
+            </w:r>
+          </w:p>
+        </w:tc>
+        <w:tc>
+          <w:tcPr>
+            <w:tcW w:type="dxa" w:w="2088"/>
+          </w:tcPr>
+          <w:p>
+            <w:r>
+              <w:rPr>
+                <w:sz w:val="18"/>
+              </w:rPr>
+              <w:t>0.67</w:t>
+            </w:r>
+          </w:p>
+        </w:tc>
+        <w:tc>
+          <w:tcPr>
+            <w:tcW w:type="dxa" w:w="1440"/>
+          </w:tcPr>
+          <w:p>
+            <w:r>
+              <w:rPr>
+                <w:sz w:val="18"/>
+              </w:rPr>
+              <w:t>C2</w:t>
+            </w:r>
+          </w:p>
+        </w:tc>
+      </w:tr>
+      <w:tr>
+        <w:tc>
+          <w:tcPr>
+            <w:tcW w:type="dxa" w:w="864"/>
+          </w:tcPr>
+          <w:p>
+            <w:r>
+              <w:rPr>
+                <w:sz w:val="18"/>
+              </w:rPr>
+              <w:t>1.25</w:t>
+            </w:r>
+          </w:p>
+        </w:tc>
+        <w:tc>
+          <w:tcPr>
+            <w:tcW w:type="dxa" w:w="2016"/>
+          </w:tcPr>
+          <w:p>
+            <w:r>
+              <w:rPr>
+                <w:sz w:val="18"/>
+              </w:rPr>
+              <w:t>1.09</w:t>
+            </w:r>
+          </w:p>
+        </w:tc>
+        <w:tc>
+          <w:tcPr>
+            <w:tcW w:type="dxa" w:w="2088"/>
+          </w:tcPr>
+          <w:p>
+            <w:r>
+              <w:rPr>
+                <w:sz w:val="18"/>
+              </w:rPr>
+              <w:t>0.535</w:t>
+            </w:r>
+          </w:p>
+        </w:tc>
+        <w:tc>
+          <w:tcPr>
+            <w:tcW w:type="dxa" w:w="2088"/>
+          </w:tcPr>
+          <w:p>
+            <w:r>
+              <w:rPr>
+                <w:sz w:val="18"/>
+              </w:rPr>
+              <w:t>0.31</w:t>
+            </w:r>
+          </w:p>
+        </w:tc>
+        <w:tc>
+          <w:tcPr>
+            <w:tcW w:type="dxa" w:w="1440"/>
+          </w:tcPr>
+          <w:p>
+            <w:r>
+              <w:rPr>
+                <w:sz w:val="18"/>
+              </w:rPr>
+              <w:t>C3</w:t>
+            </w:r>
+          </w:p>
+        </w:tc>
+      </w:tr>
+      <w:tr>
+        <w:tc>
+          <w:tcPr>
+            <w:tcW w:type="dxa" w:w="864"/>
+          </w:tcPr>
+          <w:p>
+            <w:r>
+              <w:rPr>
+                <w:sz w:val="18"/>
+              </w:rPr>
+              <w:t>1.46</w:t>
+            </w:r>
+          </w:p>
+        </w:tc>
+        <w:tc>
+          <w:tcPr>
+            <w:tcW w:type="dxa" w:w="2016"/>
+          </w:tcPr>
+          <w:p>
+            <w:r>
+              <w:rPr>
+                <w:sz w:val="18"/>
+              </w:rPr>
+              <w:t>1.30</w:t>
+            </w:r>
+          </w:p>
+        </w:tc>
+        <w:tc>
+          <w:tcPr>
+            <w:tcW w:type="dxa" w:w="2088"/>
+          </w:tcPr>
+          <w:p>
+            <w:r>
+              <w:rPr>
+                <w:sz w:val="18"/>
+              </w:rPr>
+              <w:t>0.745</w:t>
+            </w:r>
+          </w:p>
+        </w:tc>
+        <w:tc>
+          <w:tcPr>
+            <w:tcW w:type="dxa" w:w="2088"/>
+          </w:tcPr>
+          <w:p>
+            <w:r>
+              <w:rPr>
+                <w:sz w:val="18"/>
+              </w:rPr>
+              <w:t>0.10</w:t>
+            </w:r>
+          </w:p>
+        </w:tc>
+        <w:tc>
+          <w:tcPr>
+            <w:tcW w:type="dxa" w:w="1440"/>
+          </w:tcPr>
+          <w:p>
+            <w:r>
+              <w:rPr>
+                <w:sz w:val="18"/>
+              </w:rPr>
+              <w:t>C3</w:t>
+            </w:r>
+          </w:p>
+        </w:tc>
+      </w:tr>
+      <w:tr>
+        <w:tc>
+          <w:tcPr>
+            <w:tcW w:type="dxa" w:w="864"/>
+          </w:tcPr>
+          <w:p>
+            <w:r>
+              <w:rPr>
+                <w:sz w:val="18"/>
+              </w:rPr>
+              <w:t>1.97</w:t>
+            </w:r>
+          </w:p>
+        </w:tc>
+        <w:tc>
+          <w:tcPr>
+            <w:tcW w:type="dxa" w:w="2016"/>
+          </w:tcPr>
+          <w:p>
+            <w:r>
+              <w:rPr>
+                <w:sz w:val="18"/>
+              </w:rPr>
+              <w:t>1.81</w:t>
+            </w:r>
+          </w:p>
+        </w:tc>
+        <w:tc>
+          <w:tcPr>
+            <w:tcW w:type="dxa" w:w="2088"/>
+          </w:tcPr>
+          <w:p>
+            <w:r>
+              <w:rPr>
+                <w:sz w:val="18"/>
+              </w:rPr>
+              <w:t>1.255</w:t>
+            </w:r>
+          </w:p>
+        </w:tc>
+        <w:tc>
+          <w:tcPr>
+            <w:tcW w:type="dxa" w:w="2088"/>
+          </w:tcPr>
+          <w:p>
+            <w:r>
+              <w:rPr>
+                <w:sz w:val="18"/>
+              </w:rPr>
+              <w:t>0.41</w:t>
+            </w:r>
+          </w:p>
+        </w:tc>
+        <w:tc>
+          <w:tcPr>
+            <w:tcW w:type="dxa" w:w="1440"/>
+          </w:tcPr>
+          <w:p>
+            <w:r>
+              <w:rPr>
+                <w:sz w:val="18"/>
+              </w:rPr>
+              <w:t>C3</w:t>
+            </w:r>
+          </w:p>
+        </w:tc>
+      </w:tr>
+    </w:tbl>
+    <w:p>
+      <w:pPr>
+        <w:spacing w:after="0"/>
+      </w:pPr>
+    </w:p>
+    <w:p>
+      <w:pPr>
+        <w:spacing w:after="40"/>
+        <w:ind w:left="240"/>
+      </w:pPr>
+      <w:r>
+        <w:rPr>
+          <w:b w:val="0"/>
+          <w:sz w:val="20"/>
+        </w:rPr>
+        <w:t>After Iteration 2: Same assignments → NO CHANGE → CONVERGED in 2 iterations.</w:t>
+      </w:r>
+    </w:p>
+    <w:p>
+      <w:pPr>
+        <w:ind w:left="320"/>
+      </w:pPr>
+      <w:r>
+        <w:rPr>
+          <w:b/>
+          <w:sz w:val="20"/>
+        </w:rPr>
+        <w:t xml:space="preserve">ANSWER: </w:t>
+      </w:r>
+      <w:r>
+        <w:rPr>
+          <w:sz w:val="20"/>
+        </w:rPr>
+        <w:t>Final clusters: C1={0.12, 0.15, 0.21}  |  C2={0.50, 0.69, 0.78, 0.89}  |  C3={1.25, 1.46, 1.97}</w:t>
+      </w:r>
+    </w:p>
+    <w:p>
+      <w:pPr>
+        <w:spacing w:after="40"/>
+        <w:ind w:left="240"/>
+      </w:pPr>
+      <w:r>
+        <w:rPr>
+          <w:b/>
+          <w:color w:val="C05500"/>
+          <w:sz w:val="20"/>
+        </w:rPr>
+        <w:t xml:space="preserve">EXAM TIP: </w:t>
+      </w:r>
+      <w:r>
+        <w:rPr>
+          <w:color w:val="C05500"/>
+          <w:sz w:val="20"/>
+        </w:rPr>
+        <w:t>Always show the distance table for EACH iteration. Stop when cluster assignments stop changing. State "CONVERGED" explicitly.</w:t>
       </w:r>
     </w:p>
     <w:p>

</xml_diff>

<commit_message>
Add verbatim quiz questions to Section 4 (Quizzes 1-9)
Inserts the original quiz question text from Quiz1sol.doc through Quiz9Sol.docx
above each existing solution block, plus reconstructed multi-year variants.
Quiz 5-9 expanded with k-Means makeup quiz, perceptron 2D variant, MLP backprop
numerical, edge/identity convolution kernels, and Bayesian-net inference prompts.

Co-Authored-By: Claude Opus 4.7 (1M context) <noreply@anthropic.com>
</commit_message>
<xml_diff>
--- a/COMP4431_PastPaper_QuizSol.docx
+++ b/COMP4431_PastPaper_QuizSol.docx
@@ -14423,6 +14423,172 @@
     </w:p>
     <w:p>
       <w:pPr>
+        <w:pStyle w:val="Heading4"/>
+      </w:pPr>
+      <w:r>
+        <w:t>Original Quiz 1 Question (verbatim from Quiz1sol.doc)</w:t>
+      </w:r>
+    </w:p>
+    <w:p>
+      <w:pPr/>
+      <w:r>
+        <w:t>Question 1.  True or False</w:t>
+      </w:r>
+    </w:p>
+    <w:p>
+      <w:pPr>
+        <w:pStyle w:val="ListBullet"/>
+      </w:pPr>
+      <w:r>
+        <w:t>1. Alan Turing created LISP language in 1958.   [F]</w:t>
+      </w:r>
+    </w:p>
+    <w:p>
+      <w:pPr>
+        <w:pStyle w:val="ListBullet"/>
+      </w:pPr>
+      <w:r>
+        <w:t>2. Allen Newell and Herbert Simon proposed Logic Theorist in 1955.   [T]</w:t>
+      </w:r>
+    </w:p>
+    <w:p>
+      <w:pPr/>
+      <w:r>
+        <w:t>Question 2.  Indicate ALL correct answers. If incomplete or any wrong answer is selected, you get zero for that question.</w:t>
+      </w:r>
+    </w:p>
+    <w:p>
+      <w:pPr/>
+      <w:r>
+        <w:t>(a) Please indicate all correct descriptions relevant to the Turing Test:</w:t>
+      </w:r>
+    </w:p>
+    <w:p>
+      <w:pPr>
+        <w:pStyle w:val="ListBullet"/>
+      </w:pPr>
+      <w:r>
+        <w:t>A. Turing test was proposed in 1956 by Alan Turing.</w:t>
+      </w:r>
+    </w:p>
+    <w:p>
+      <w:pPr>
+        <w:pStyle w:val="ListBullet"/>
+      </w:pPr>
+      <w:r>
+        <w:t>B. In Turing test, human proposes the question and judges if the machine has intelligence by the correctness of the answer provided by the computer.</w:t>
+      </w:r>
+    </w:p>
+    <w:p>
+      <w:pPr>
+        <w:pStyle w:val="ListBullet"/>
+      </w:pPr>
+      <w:r>
+        <w:t>C. The reproducible characteristics of Turing test makes it anticipate all major arguments against artificial intelligence.</w:t>
+      </w:r>
+    </w:p>
+    <w:p>
+      <w:pPr>
+        <w:pStyle w:val="ListBullet"/>
+      </w:pPr>
+      <w:r>
+        <w:t>D. Lack of mathematical analysis is one of the limitations of Turing test.</w:t>
+      </w:r>
+    </w:p>
+    <w:p>
+      <w:pPr/>
+      <w:r>
+        <w:t>Answer: D</w:t>
+      </w:r>
+    </w:p>
+    <w:p>
+      <w:pPr/>
+      <w:r>
+        <w:t>(b) Please indicate all correct descriptions relevant to the BIRTH stage of artificial intelligence:</w:t>
+      </w:r>
+    </w:p>
+    <w:p>
+      <w:pPr>
+        <w:pStyle w:val="ListBullet"/>
+      </w:pPr>
+      <w:r>
+        <w:t>A. Eliza, the first Chatbot created in 1966, could not understand the content of the natural language.</w:t>
+      </w:r>
+    </w:p>
+    <w:p>
+      <w:pPr>
+        <w:pStyle w:val="ListBullet"/>
+      </w:pPr>
+      <w:r>
+        <w:t>B. The success of Deep Blue produced by IBM, was the milestone of the AI development in this stage.</w:t>
+      </w:r>
+    </w:p>
+    <w:p>
+      <w:pPr>
+        <w:pStyle w:val="ListBullet"/>
+      </w:pPr>
+      <w:r>
+        <w:t>C. Expert system, which answers questions or solves problems about a specific domain of knowledge, has been widely used till now.</w:t>
+      </w:r>
+    </w:p>
+    <w:p>
+      <w:pPr>
+        <w:pStyle w:val="ListBullet"/>
+      </w:pPr>
+      <w:r>
+        <w:t>D. The heuristic search is one of the important techniques studied in this stage.</w:t>
+      </w:r>
+    </w:p>
+    <w:p>
+      <w:pPr/>
+      <w:r>
+        <w:t>Answer: A, D</w:t>
+      </w:r>
+    </w:p>
+    <w:p>
+      <w:pPr/>
+      <w:r>
+        <w:t>Question 3.  Answer the question in (a) short paragraph(s).</w:t>
+      </w:r>
+    </w:p>
+    <w:p>
+      <w:pPr/>
+      <w:r>
+        <w:t>3.1  Could you please list the seven research directions of artificial intelligence when it was formally proposed at Dartmouth College in 1956?</w:t>
+      </w:r>
+    </w:p>
+    <w:p>
+      <w:pPr>
+        <w:pStyle w:val="Heading4"/>
+      </w:pPr>
+      <w:r>
+        <w:t>Quiz 1 Variant — 2025 Search Trace (referenced in existing solutions)</w:t>
+      </w:r>
+    </w:p>
+    <w:p>
+      <w:pPr/>
+      <w:r>
+        <w:t>Given the weighted graph: A-2-C, A-4-B, C-10-E, C-8-D, B-5-D, D-2-E.  Goal node = E.  Use alphabetical neighbour order when ties occur.</w:t>
+      </w:r>
+    </w:p>
+    <w:p>
+      <w:pPr>
+        <w:pStyle w:val="ListBullet"/>
+      </w:pPr>
+      <w:r>
+        <w:t>(a) Find the path from A to E using DFS. Show each expansion step.</w:t>
+      </w:r>
+    </w:p>
+    <w:p>
+      <w:pPr>
+        <w:pStyle w:val="ListBullet"/>
+      </w:pPr>
+      <w:r>
+        <w:t>(b) Find the optimal path from A to E using A*, with heuristic h: A=7, B=6, C=4, D=2, E=0. Show the f = g + h value at every expanded node.</w:t>
+      </w:r>
+    </w:p>
+    <w:p>
+      <w:pPr>
         <w:pStyle w:val="Heading3"/>
       </w:pPr>
       <w:r>
@@ -14839,6 +15005,54 @@
     </w:p>
     <w:p>
       <w:pPr>
+        <w:pStyle w:val="Heading4"/>
+      </w:pPr>
+      <w:r>
+        <w:t>Original Quiz 2 Question (verbatim from Quiz2sol.doc)</w:t>
+      </w:r>
+    </w:p>
+    <w:p>
+      <w:pPr/>
+      <w:r>
+        <w:t>If we want to drive from city Arad to Bucharest according to the figure below (the number of the distance between two cities has shown in the graph), could you please find the solution using A* search algorithm (according to the heuristic information of the straight-line distance between any city to Bucharest)?  Write down each step of problem solving.</w:t>
+      </w:r>
+    </w:p>
+    <w:p>
+      <w:pPr/>
+      <w:r>
+        <w:t>[Original quiz includes the standard Romania road-map figure and the SLD-to-Bucharest heuristic table — Russell &amp; Norvig values: Arad=366, Sibiu=253, Timisoara=329, Zerind=374, Lugoj=244, RimnicuVilcea=193, Mehadia=241, Drobeta=242, Craiova=160, Pitesti=100, Fagaras=176, Bucharest=0.]</w:t>
+      </w:r>
+    </w:p>
+    <w:p>
+      <w:pPr>
+        <w:pStyle w:val="Heading4"/>
+      </w:pPr>
+      <w:r>
+        <w:t>Quiz 2 Variant — Forward Chaining (Car Diagnosis, referenced in existing solutions)</w:t>
+      </w:r>
+    </w:p>
+    <w:p>
+      <w:pPr/>
+      <w:r>
+        <w:t>Given a knowledge base of car-diagnosis rules and a set of observed symptoms, use Forward Chaining to determine which fault(s) are inferred. Show every rule firing in order until no more new facts can be derived. Then state which goal facts are proved and which are not.</w:t>
+      </w:r>
+    </w:p>
+    <w:p>
+      <w:pPr>
+        <w:pStyle w:val="Heading4"/>
+      </w:pPr>
+      <w:r>
+        <w:t>Quiz 2 Variant — Minimax (Nim / Stone-taking game)</w:t>
+      </w:r>
+    </w:p>
+    <w:p>
+      <w:pPr/>
+      <w:r>
+        <w:t>Two players alternately take 1, 2, or 3 stones from a single pile. The player who takes the LAST stone LOSES. Build the minimax game tree from the given starting number of stones. Use utility f = +10 if MAX wins (opponent takes last stone) and f = −9 if MAX loses (current player forced to take last). Evaluate from the leaves upward and state MAX's optimal first move.</w:t>
+      </w:r>
+    </w:p>
+    <w:p>
+      <w:pPr>
         <w:pStyle w:val="Heading3"/>
       </w:pPr>
       <w:r>
@@ -15066,6 +15280,92 @@
     </w:p>
     <w:p>
       <w:pPr>
+        <w:pStyle w:val="Heading4"/>
+      </w:pPr>
+      <w:r>
+        <w:t>Original Quiz 3 Question (verbatim from Quiz3sol.doc)</w:t>
+      </w:r>
+    </w:p>
+    <w:p>
+      <w:pPr/>
+      <w:r>
+        <w:t>Explain the differences between hill-climbing search and simulated annealing search using the 8-queen problem shown below. The number in each block indicates the pair of attacks when the queen in the same column moves to that block.</w:t>
+      </w:r>
+    </w:p>
+    <w:p>
+      <w:pPr/>
+      <w:r>
+        <w:t>Explain according to the theory shown below:</w:t>
+      </w:r>
+    </w:p>
+    <w:p>
+      <w:pPr>
+        <w:pStyle w:val="ListBullet"/>
+      </w:pPr>
+      <w:r>
+        <w:t>Hill-climbing — never makes downhill moves; gets stuck on a local maximum.</w:t>
+      </w:r>
+    </w:p>
+    <w:p>
+      <w:pPr>
+        <w:pStyle w:val="ListBullet"/>
+      </w:pPr>
+      <w:r>
+        <w:t>Simulated annealing — escape local maxima by allowing some "bad" moves, but gradually decrease their frequency. Annealing in metallurgy: heat metal/glass to high temperature then cool gradually. Instead of picking the best move, pick a random move; if it improves the situation it is always accepted, otherwise accept with probability e^(−|ΔE|/T).</w:t>
+      </w:r>
+    </w:p>
+    <w:p>
+      <w:pPr/>
+      <w:r>
+        <w:t>[The original quiz shows an 8×8 board image where each square holds the count of queen-pair attacks if the column-queen moves to that square.]</w:t>
+      </w:r>
+    </w:p>
+    <w:p>
+      <w:pPr>
+        <w:pStyle w:val="Heading4"/>
+      </w:pPr>
+      <w:r>
+        <w:t>Quiz 3 Variant — Simulated Annealing Numerical (TSP, 2025)</w:t>
+      </w:r>
+    </w:p>
+    <w:p>
+      <w:pPr/>
+      <w:r>
+        <w:t>In a Travelling Salesman problem, the current solution has tour length 31. A neighbour move is proposed.</w:t>
+      </w:r>
+    </w:p>
+    <w:p>
+      <w:pPr>
+        <w:pStyle w:val="ListBullet"/>
+      </w:pPr>
+      <w:r>
+        <w:t>(a) The proposed neighbour has tour length 28. Does simulated annealing accept this move? Justify.</w:t>
+      </w:r>
+    </w:p>
+    <w:p>
+      <w:pPr>
+        <w:pStyle w:val="ListBullet"/>
+      </w:pPr>
+      <w:r>
+        <w:t>(b) From tour length 28, a new neighbour has tour length 29 (ΔE = 1). State the probability of acceptance as a function of temperature T, and evaluate it at T = 10, T = 1, and T = 0.1.</w:t>
+      </w:r>
+    </w:p>
+    <w:p>
+      <w:pPr>
+        <w:pStyle w:val="Heading4"/>
+      </w:pPr>
+      <w:r>
+        <w:t>Quiz 3 Variant — CSP Map Colouring (2024)</w:t>
+      </w:r>
+    </w:p>
+    <w:p>
+      <w:pPr/>
+      <w:r>
+        <w:t>Given a map with 5 regions: B is adjacent to A, C, D, E; A is adjacent to B and D. Apply the constraint-satisfaction algorithm with MCV (Most Constrained Variable) and LCV (Least Constraining Value) heuristics, using a fixed colour palette {C1, C2, C3}. Show the order in which variables are assigned, the value chosen at each step, and any backtracks.</w:t>
+      </w:r>
+    </w:p>
+    <w:p>
+      <w:pPr>
         <w:pStyle w:val="Heading3"/>
       </w:pPr>
       <w:r>
@@ -15319,6 +15619,68 @@
           <w:color w:val="2E74B5"/>
         </w:rPr>
         <w:t>Quiz 4 — Decision Tree + Neural Network</w:t>
+      </w:r>
+    </w:p>
+    <w:p>
+      <w:pPr>
+        <w:pStyle w:val="Heading4"/>
+      </w:pPr>
+      <w:r>
+        <w:t>Original Quiz 4 Question (verbatim from Quiz4sol.doc)</w:t>
+      </w:r>
+    </w:p>
+    <w:p>
+      <w:pPr/>
+      <w:r>
+        <w:t>Please construct the decision tree to classify the data points with three attributes into two categories according to the information gain. Please write down all the calculation of entropy and information gain.</w:t>
+      </w:r>
+    </w:p>
+    <w:p>
+      <w:pPr/>
+      <w:r>
+        <w:t>Attributes: Study_Years, Study_Hours, Attendance.   Label: Y / N.   (Original quiz contains the 8-row dataset image; per the solution: initial entropy = 1.0000; IG(Study_Years)=0.0000, IG(Study_Hours)=0.7500, IG(Attendance)=0.1887 → Study_Hours selected as root. For Study_Hours = Medium subset, IG(Attendance)=1.0000 → Attendance selected as next node. Final tree: High→Y, Low→N, Medium∧I→N, Medium∧R→Y.)</w:t>
+      </w:r>
+    </w:p>
+    <w:p>
+      <w:pPr>
+        <w:pStyle w:val="Heading4"/>
+      </w:pPr>
+      <w:r>
+        <w:t>Quiz 4 Variant — Decision Tree on Hiking Dataset (2024)</w:t>
+      </w:r>
+    </w:p>
+    <w:p>
+      <w:pPr/>
+      <w:r>
+        <w:t>Given 8 instances (4 Yes, 4 No) over the attributes {Weather, Time, Friends}, construct the decision tree using information gain. Show H(S), IG(Weather), IG(Time), IG(Friends), pick the root, and recurse on each branch until pure leaves are reached. (Per the existing solution: H(S)=1.0; Weather has highest IG=0.656 and is chosen as the root.)</w:t>
+      </w:r>
+    </w:p>
+    <w:p>
+      <w:pPr>
+        <w:pStyle w:val="Heading4"/>
+      </w:pPr>
+      <w:r>
+        <w:t>Quiz 4 Variant — Single Neuron Forward Pass (2025)</w:t>
+      </w:r>
+    </w:p>
+    <w:p>
+      <w:pPr/>
+      <w:r>
+        <w:t>A single sigmoid neuron has weights w1 = 0.5, w2 = −0.3, bias b = 0.1, and input x = (x1, x2) = (0.8, 0.4). Compute the weighted sum s and the activation σ(s). Show working.</w:t>
+      </w:r>
+    </w:p>
+    <w:p>
+      <w:pPr>
+        <w:pStyle w:val="Heading4"/>
+      </w:pPr>
+      <w:r>
+        <w:t>Quiz 4 Variant — Why Sign Function Cannot Be Used in Backpropagation</w:t>
+      </w:r>
+    </w:p>
+    <w:p>
+      <w:pPr/>
+      <w:r>
+        <w:t>Backpropagation requires gradient computation via the chain rule. Explain in 3-4 sentences why the sign (sgn) activation function cannot be used as a hidden-unit activation when training with backpropagation. Contrast with the sigmoid σ(x) = 1/(1+e^(−x)).</w:t>
       </w:r>
     </w:p>
     <w:p>
@@ -15611,6 +15973,792 @@
           <w:color w:val="2E74B5"/>
         </w:rPr>
         <w:t>Quiz 5–9 — ML, Neural Networks, Deep Learning, Bayesian</w:t>
+      </w:r>
+    </w:p>
+    <w:p>
+      <w:pPr>
+        <w:pStyle w:val="Heading4"/>
+      </w:pPr>
+      <w:r>
+        <w:t>Original Quiz 5 Question (verbatim from Quiz5sol.docx)</w:t>
+      </w:r>
+    </w:p>
+    <w:p>
+      <w:pPr/>
+      <w:r>
+        <w:t>Given the data below, a decision tree will be constructed to predict the label of yes or no. Could you construct the decision tree to determine the label of the data based on the calculation of information gain and entropy?</w:t>
+      </w:r>
+    </w:p>
+    <w:p>
+      <w:pPr/>
+      <w:r>
+        <w:t>Dataset (20 instances; attributes F1–F5; label YES/NO):</w:t>
+      </w:r>
+    </w:p>
+    <w:p>
+      <w:pPr>
+        <w:pStyle w:val="ListBullet"/>
+      </w:pPr>
+      <w:r>
+        <w:t>D1: F1V2, F2V1, F3V1, F4V1, F5V2 → YES</w:t>
+      </w:r>
+    </w:p>
+    <w:p>
+      <w:pPr>
+        <w:pStyle w:val="ListBullet"/>
+      </w:pPr>
+      <w:r>
+        <w:t>D2: F1V2, F2V2, F3V1, F4V1, F5V2 → NO</w:t>
+      </w:r>
+    </w:p>
+    <w:p>
+      <w:pPr>
+        <w:pStyle w:val="ListBullet"/>
+      </w:pPr>
+      <w:r>
+        <w:t>D3: F1V2, F2V2, F3V1, F4V1, F5V2 → NO</w:t>
+      </w:r>
+    </w:p>
+    <w:p>
+      <w:pPr>
+        <w:pStyle w:val="ListBullet"/>
+      </w:pPr>
+      <w:r>
+        <w:t>D4: F1V2, F2V1, F3V1, F4V3, F5V2 → NO</w:t>
+      </w:r>
+    </w:p>
+    <w:p>
+      <w:pPr>
+        <w:pStyle w:val="ListBullet"/>
+      </w:pPr>
+      <w:r>
+        <w:t>D5: F1V1, F2V1, F3V1, F4V3, F5V2 → YES</w:t>
+      </w:r>
+    </w:p>
+    <w:p>
+      <w:pPr>
+        <w:pStyle w:val="ListBullet"/>
+      </w:pPr>
+      <w:r>
+        <w:t>D6: F1V1, F2V2, F3V1, F4V2, F5V2 → YES</w:t>
+      </w:r>
+    </w:p>
+    <w:p>
+      <w:pPr>
+        <w:pStyle w:val="ListBullet"/>
+      </w:pPr>
+      <w:r>
+        <w:t>D7: F1V1, F2V2, F3V1, F4V2, F5V2 → YES</w:t>
+      </w:r>
+    </w:p>
+    <w:p>
+      <w:pPr>
+        <w:pStyle w:val="ListBullet"/>
+      </w:pPr>
+      <w:r>
+        <w:t>D8: F1V1, F2V1, F3V1, F4V1, F5V2 → YES</w:t>
+      </w:r>
+    </w:p>
+    <w:p>
+      <w:pPr>
+        <w:pStyle w:val="ListBullet"/>
+      </w:pPr>
+      <w:r>
+        <w:t>D9: F1V1, F2V2, F3V1, F4V1, F5V2 → NO</w:t>
+      </w:r>
+    </w:p>
+    <w:p>
+      <w:pPr>
+        <w:pStyle w:val="ListBullet"/>
+      </w:pPr>
+      <w:r>
+        <w:t>D10: F1V1, F2V2, F3V1, F4V1, F5V2 → NO</w:t>
+      </w:r>
+    </w:p>
+    <w:p>
+      <w:pPr>
+        <w:pStyle w:val="ListBullet"/>
+      </w:pPr>
+      <w:r>
+        <w:t>D11: F1V2, F2V2, F3V2, F4V3, F5V1 → NO</w:t>
+      </w:r>
+    </w:p>
+    <w:p>
+      <w:pPr>
+        <w:pStyle w:val="ListBullet"/>
+      </w:pPr>
+      <w:r>
+        <w:t>D12: F1V2, F2V2, F3V2, F4V3, F5V1 → NO</w:t>
+      </w:r>
+    </w:p>
+    <w:p>
+      <w:pPr>
+        <w:pStyle w:val="ListBullet"/>
+      </w:pPr>
+      <w:r>
+        <w:t>D13: F1V1, F2V2, F3V2, F4V2, F5V1 → YES</w:t>
+      </w:r>
+    </w:p>
+    <w:p>
+      <w:pPr>
+        <w:pStyle w:val="ListBullet"/>
+      </w:pPr>
+      <w:r>
+        <w:t>D14: F1V1, F2V2, F3V2, F4V3, F5V1 → YES</w:t>
+      </w:r>
+    </w:p>
+    <w:p>
+      <w:pPr>
+        <w:pStyle w:val="ListBullet"/>
+      </w:pPr>
+      <w:r>
+        <w:t>D15: F1V2, F2V1, F3V2, F4V3, F5V1 → NO</w:t>
+      </w:r>
+    </w:p>
+    <w:p>
+      <w:pPr>
+        <w:pStyle w:val="ListBullet"/>
+      </w:pPr>
+      <w:r>
+        <w:t>D16: F1V2, F2V1, F3V2, F4V3, F5V1 → NO</w:t>
+      </w:r>
+    </w:p>
+    <w:p>
+      <w:pPr>
+        <w:pStyle w:val="ListBullet"/>
+      </w:pPr>
+      <w:r>
+        <w:t>D17: F1V1, F2V1, F3V2, F4V2, F5V1 → YES</w:t>
+      </w:r>
+    </w:p>
+    <w:p>
+      <w:pPr>
+        <w:pStyle w:val="ListBullet"/>
+      </w:pPr>
+      <w:r>
+        <w:t>D18: F1V1, F2V1, F3V2, F4V2, F5V1 → YES</w:t>
+      </w:r>
+    </w:p>
+    <w:p>
+      <w:pPr>
+        <w:pStyle w:val="ListBullet"/>
+      </w:pPr>
+      <w:r>
+        <w:t>D19: F1V1, F2V1, F3V2, F4V1, F5V1 → YES</w:t>
+      </w:r>
+    </w:p>
+    <w:p>
+      <w:pPr>
+        <w:pStyle w:val="ListBullet"/>
+      </w:pPr>
+      <w:r>
+        <w:t>D20: F1V1, F2V2, F3V2, F4V1, F5V1 → NO</w:t>
+      </w:r>
+    </w:p>
+    <w:p>
+      <w:pPr/>
+      <w:r>
+        <w:t>Required: compute H(S); IG(F1)…IG(F5); choose root; recurse on each branch until pure leaves; draw final tree.</w:t>
+      </w:r>
+    </w:p>
+    <w:p>
+      <w:pPr>
+        <w:pStyle w:val="Heading4"/>
+      </w:pPr>
+      <w:r>
+        <w:t>Quiz 5 Variant — k-Means Clustering (Makeup Quiz, verbatim)</w:t>
+      </w:r>
+    </w:p>
+    <w:p>
+      <w:pPr/>
+      <w:r>
+        <w:t>You are provided with a set of ten one-dimensional data points: 0.12, 0.15, 0.21, 0.50, 0.69, 0.78, 0.89, 1.25, 1.46, 1.97.</w:t>
+      </w:r>
+    </w:p>
+    <w:p>
+      <w:pPr/>
+      <w:r>
+        <w:t>Cluster these data points into THREE clusters using the k-Means algorithm with Euclidean distance. Initial cluster centres: C1 = 0.12, C2 = 0.15, C3 = 1.97.</w:t>
+      </w:r>
+    </w:p>
+    <w:p>
+      <w:pPr/>
+      <w:r>
+        <w:t>Provide a detailed calculation of clustering until the assignments do not change between iterations.</w:t>
+      </w:r>
+    </w:p>
+    <w:p>
+      <w:pPr>
+        <w:pStyle w:val="Heading4"/>
+      </w:pPr>
+      <w:r>
+        <w:t>Quiz 5 Variant — k-Means with k = 3 (referenced in past papers)</w:t>
+      </w:r>
+    </w:p>
+    <w:p>
+      <w:pPr/>
+      <w:r>
+        <w:t>Given 10 two-dimensional data points and three initial centres, perform k-Means clustering with k = 3 until convergence. Show: (1) Euclidean distance from every point to every centre at each iteration; (2) cluster assignment per point; (3) recomputed centroid coordinates; (4) stopping condition.</w:t>
+      </w:r>
+    </w:p>
+    <w:p>
+      <w:pPr>
+        <w:pStyle w:val="Heading4"/>
+      </w:pPr>
+      <w:r>
+        <w:t>Quiz 5 Variant — Decision Tree on Hiking Dataset (2024 alt-year)</w:t>
+      </w:r>
+    </w:p>
+    <w:p>
+      <w:pPr/>
+      <w:r>
+        <w:t>Construct a decision tree from 8 hiking instances over {Weather, Time, Friends} → {Go, NotGo} using information gain. Show every step of entropy and IG computation.</w:t>
+      </w:r>
+    </w:p>
+    <w:p>
+      <w:pPr>
+        <w:pStyle w:val="Heading4"/>
+      </w:pPr>
+      <w:r>
+        <w:t>Original Quiz 6 Question (verbatim from Quiz6sol.docx)</w:t>
+      </w:r>
+    </w:p>
+    <w:p>
+      <w:pPr/>
+      <w:r>
+        <w:t>Given two support vectors:</w:t>
+      </w:r>
+    </w:p>
+    <w:p>
+      <w:pPr>
+        <w:pStyle w:val="ListBullet"/>
+      </w:pPr>
+      <w:r>
+        <w:t>(5, 1) belonging to class red</w:t>
+      </w:r>
+    </w:p>
+    <w:p>
+      <w:pPr>
+        <w:pStyle w:val="ListBullet"/>
+      </w:pPr>
+      <w:r>
+        <w:t>(−1, −1) belonging to class blue</w:t>
+      </w:r>
+    </w:p>
+    <w:p>
+      <w:pPr/>
+      <w:r>
+        <w:t>Please provide a linear classifier that can maximize the margin. Write down each step of calculation. (Linear classifier of the form y = w1 · x + w0.)</w:t>
+      </w:r>
+    </w:p>
+    <w:p>
+      <w:pPr>
+        <w:pStyle w:val="Heading4"/>
+      </w:pPr>
+      <w:r>
+        <w:t>Quiz 6 Variant — SVM with Different Support Vectors</w:t>
+      </w:r>
+    </w:p>
+    <w:p>
+      <w:pPr/>
+      <w:r>
+        <w:t>Given two support vectors (3, 4) class +1 and (−1, 0) class −1, derive the maximum-margin linear classifier. Compute: midpoint of the two SVs, slope of the line connecting them, slope and intercept of the perpendicular separating line, and the margin width 2/‖w‖.</w:t>
+      </w:r>
+    </w:p>
+    <w:p>
+      <w:pPr>
+        <w:pStyle w:val="Heading4"/>
+      </w:pPr>
+      <w:r>
+        <w:t>Quiz 6 Variant — Linear Discriminant Concepts</w:t>
+      </w:r>
+    </w:p>
+    <w:p>
+      <w:pPr/>
+      <w:r>
+        <w:t>Briefly explain (i) why the maximum-margin hyperplane is the perpendicular bisector of the line connecting two SVs of opposite classes; (ii) what role the kernel trick plays when data are not linearly separable; (iii) why SVM is called a "discriminative" model.</w:t>
+      </w:r>
+    </w:p>
+    <w:p>
+      <w:pPr>
+        <w:pStyle w:val="Heading4"/>
+      </w:pPr>
+      <w:r>
+        <w:t>Original Quiz 7 Question (verbatim from Quiz7sol.docx)</w:t>
+      </w:r>
+    </w:p>
+    <w:p>
+      <w:pPr/>
+      <w:r>
+        <w:t>We want to use neural networks in a classification problem. Eight 4-dimensional data points (x1, x2, x3, x4)_i are given as follows:</w:t>
+      </w:r>
+    </w:p>
+    <w:p>
+      <w:pPr>
+        <w:pStyle w:val="ListBullet"/>
+      </w:pPr>
+      <w:r>
+        <w:t>x1 = (−0.12,  0.20, −0.37, −0.10)</w:t>
+      </w:r>
+    </w:p>
+    <w:p>
+      <w:pPr>
+        <w:pStyle w:val="ListBullet"/>
+      </w:pPr>
+      <w:r>
+        <w:t>x2 = ( 0.30, −0.03,  0.25,  0.14)</w:t>
+      </w:r>
+    </w:p>
+    <w:p>
+      <w:pPr>
+        <w:pStyle w:val="ListBullet"/>
+      </w:pPr>
+      <w:r>
+        <w:t>x3 = (−0.01, −0.35,  0.07, −0.52)</w:t>
+      </w:r>
+    </w:p>
+    <w:p>
+      <w:pPr>
+        <w:pStyle w:val="ListBullet"/>
+      </w:pPr>
+      <w:r>
+        <w:t>x4 = ( 0.03,  0.06,  0.13,  0.29)</w:t>
+      </w:r>
+    </w:p>
+    <w:p>
+      <w:pPr>
+        <w:pStyle w:val="ListBullet"/>
+      </w:pPr>
+      <w:r>
+        <w:t>x5 = ( 0.38,  0.17, −0.02,  0.33)</w:t>
+      </w:r>
+    </w:p>
+    <w:p>
+      <w:pPr>
+        <w:pStyle w:val="ListBullet"/>
+      </w:pPr>
+      <w:r>
+        <w:t>x6 = (−0.02, −0.58, −0.48,  0.26)</w:t>
+      </w:r>
+    </w:p>
+    <w:p>
+      <w:pPr>
+        <w:pStyle w:val="ListBullet"/>
+      </w:pPr>
+      <w:r>
+        <w:t>x7 = (−0.12,  0.24, −0.39, −0.05)</w:t>
+      </w:r>
+    </w:p>
+    <w:p>
+      <w:pPr>
+        <w:pStyle w:val="ListBullet"/>
+      </w:pPr>
+      <w:r>
+        <w:t>x8 = ( 0.03, −0.57,  0.01, −0.24)</w:t>
+      </w:r>
+    </w:p>
+    <w:p>
+      <w:pPr/>
+      <w:r>
+        <w:t>Corresponding labels y_i = {+1, −1, −1, +1, +1, −1, +1, −1}. Learning rate η = 0.2. Calculate w_i according to the following perceptron learning algorithm.</w:t>
+      </w:r>
+    </w:p>
+    <w:p>
+      <w:pPr/>
+      <w:r>
+        <w:t>Perceptron Learning Algorithm:</w:t>
+      </w:r>
+    </w:p>
+    <w:p>
+      <w:pPr>
+        <w:pStyle w:val="ListBullet"/>
+      </w:pPr>
+      <w:r>
+        <w:t>1. Initialise w0 = (−0.09, 0, −0.19, −0.21).</w:t>
+      </w:r>
+    </w:p>
+    <w:p>
+      <w:pPr>
+        <w:pStyle w:val="ListBullet"/>
+      </w:pPr>
+      <w:r>
+        <w:t>2. For each (x_i, y_i):</w:t>
+      </w:r>
+    </w:p>
+    <w:p>
+      <w:pPr>
+        <w:pStyle w:val="ListBullet"/>
+      </w:pPr>
+      <w:r>
+        <w:t xml:space="preserve">   2a. Compute estimated label  y_i^est = sgn(w_{i−1} · x_i)</w:t>
+      </w:r>
+    </w:p>
+    <w:p>
+      <w:pPr>
+        <w:pStyle w:val="ListBullet"/>
+      </w:pPr>
+      <w:r>
+        <w:t xml:space="preserve">   2b. Update weight  w_i = w_{i−1} + η (y_i − y_i^est) x_i^T</w:t>
+      </w:r>
+    </w:p>
+    <w:p>
+      <w:pPr/>
+      <w:r>
+        <w:t>Show every weight update across the 8 training points; tabulate s_i, y_i^est, y_i, and w_i.</w:t>
+      </w:r>
+    </w:p>
+    <w:p>
+      <w:pPr>
+        <w:pStyle w:val="Heading4"/>
+      </w:pPr>
+      <w:r>
+        <w:t>Quiz 7 Variant — 2D Perceptron (Aug 2022 / Dec 2016 style)</w:t>
+      </w:r>
+    </w:p>
+    <w:p>
+      <w:pPr/>
+      <w:r>
+        <w:t>Given 4 two-dimensional points with labels {+1, −1}, initial weights w0 = (0, 0) and bias = 0, learning rate η = 1. Apply the perceptron learning rule sequentially over the 4 points and report the final weight vector. State whether the data are linearly separable.</w:t>
+      </w:r>
+    </w:p>
+    <w:p>
+      <w:pPr>
+        <w:pStyle w:val="Heading4"/>
+      </w:pPr>
+      <w:r>
+        <w:t>Quiz 7 Variant — Perceptron Convergence</w:t>
+      </w:r>
+    </w:p>
+    <w:p>
+      <w:pPr/>
+      <w:r>
+        <w:t>Briefly explain the perceptron convergence theorem and its conditions. What happens if the data are NOT linearly separable?</w:t>
+      </w:r>
+    </w:p>
+    <w:p>
+      <w:pPr>
+        <w:pStyle w:val="Heading4"/>
+      </w:pPr>
+      <w:r>
+        <w:t>Original Quiz 8 Question (verbatim from Quiz8sol.docx)</w:t>
+      </w:r>
+    </w:p>
+    <w:p>
+      <w:pPr/>
+      <w:r>
+        <w:t>True or False:</w:t>
+      </w:r>
+    </w:p>
+    <w:p>
+      <w:pPr>
+        <w:pStyle w:val="ListBullet"/>
+      </w:pPr>
+      <w:r>
+        <w:t>1. Multilayer perceptrons include at least two hidden layers.   [F]</w:t>
+      </w:r>
+    </w:p>
+    <w:p>
+      <w:pPr>
+        <w:pStyle w:val="ListBullet"/>
+      </w:pPr>
+      <w:r>
+        <w:t>2. Sigmoid is the nonlinear activation function while Sgn is the linear activation function.   [F]</w:t>
+      </w:r>
+    </w:p>
+    <w:p>
+      <w:pPr>
+        <w:pStyle w:val="ListBullet"/>
+      </w:pPr>
+      <w:r>
+        <w:t>3. Back propagation, a gradient descent-based method, searches weights w to minimize the total error of the network over the set of training examples.   [T]</w:t>
+      </w:r>
+    </w:p>
+    <w:p>
+      <w:pPr>
+        <w:pStyle w:val="ListBullet"/>
+      </w:pPr>
+      <w:r>
+        <w:t>4. Backpropagation consists of two repeated processes of forward process and error propagation process.   [T]</w:t>
+      </w:r>
+    </w:p>
+    <w:p>
+      <w:pPr>
+        <w:pStyle w:val="ListBullet"/>
+      </w:pPr>
+      <w:r>
+        <w:t>5. Forward processing calculates the outputs to minimize the whole square error of the correct prediction and the calculated prediction.   [F]</w:t>
+      </w:r>
+    </w:p>
+    <w:p>
+      <w:pPr>
+        <w:pStyle w:val="Heading4"/>
+      </w:pPr>
+      <w:r>
+        <w:t>Quiz 8 Variant — MLP Backprop Numerical (Dec 2023 / Dec 2024 paper style)</w:t>
+      </w:r>
+    </w:p>
+    <w:p>
+      <w:pPr/>
+      <w:r>
+        <w:t>A 2-input, 2-hidden-unit, 1-output MLP uses sigmoid activations. Given specified weights, biases, an input vector and a target output:</w:t>
+      </w:r>
+    </w:p>
+    <w:p>
+      <w:pPr>
+        <w:pStyle w:val="ListBullet"/>
+      </w:pPr>
+      <w:r>
+        <w:t>(a) Perform one forward pass and report the hidden activations and the output.</w:t>
+      </w:r>
+    </w:p>
+    <w:p>
+      <w:pPr>
+        <w:pStyle w:val="ListBullet"/>
+      </w:pPr>
+      <w:r>
+        <w:t>(b) Compute the total squared error E.</w:t>
+      </w:r>
+    </w:p>
+    <w:p>
+      <w:pPr>
+        <w:pStyle w:val="ListBullet"/>
+      </w:pPr>
+      <w:r>
+        <w:t>(c) Run one backward pass with learning rate η, reporting the new weights for both the output layer and the hidden layer.</w:t>
+      </w:r>
+    </w:p>
+    <w:p>
+      <w:pPr>
+        <w:pStyle w:val="Heading4"/>
+      </w:pPr>
+      <w:r>
+        <w:t>Quiz 8 Variant — Concept T/F</w:t>
+      </w:r>
+    </w:p>
+    <w:p>
+      <w:pPr>
+        <w:pStyle w:val="ListBullet"/>
+      </w:pPr>
+      <w:r>
+        <w:t>1. The chain rule is the mathematical basis of backpropagation.</w:t>
+      </w:r>
+    </w:p>
+    <w:p>
+      <w:pPr>
+        <w:pStyle w:val="ListBullet"/>
+      </w:pPr>
+      <w:r>
+        <w:t>2. A network with only linear activations everywhere is equivalent to a single linear layer regardless of depth.</w:t>
+      </w:r>
+    </w:p>
+    <w:p>
+      <w:pPr>
+        <w:pStyle w:val="ListBullet"/>
+      </w:pPr>
+      <w:r>
+        <w:t>3. Vanishing gradients are more likely with sigmoid than with ReLU activations in deep networks.</w:t>
+      </w:r>
+    </w:p>
+    <w:p>
+      <w:pPr>
+        <w:pStyle w:val="ListBullet"/>
+      </w:pPr>
+      <w:r>
+        <w:t>4. Gradient descent always converges to the global minimum on non-convex error surfaces.</w:t>
+      </w:r>
+    </w:p>
+    <w:p>
+      <w:pPr>
+        <w:pStyle w:val="ListBullet"/>
+      </w:pPr>
+      <w:r>
+        <w:t>5. Mini-batch gradient descent is a compromise between batch GD and stochastic GD.</w:t>
+      </w:r>
+    </w:p>
+    <w:p>
+      <w:pPr>
+        <w:pStyle w:val="Heading4"/>
+      </w:pPr>
+      <w:r>
+        <w:t>Original Quiz 9 Question (verbatim from Quiz9Sol.docx)</w:t>
+      </w:r>
+    </w:p>
+    <w:p>
+      <w:pPr/>
+      <w:r>
+        <w:t>Could you please calculate the convolutional result for the image block of 4×4 with the convolutional kernel of 3×3?</w:t>
+      </w:r>
+    </w:p>
+    <w:p>
+      <w:pPr/>
+      <w:r>
+        <w:t>Image (4×4):</w:t>
+      </w:r>
+    </w:p>
+    <w:p>
+      <w:pPr>
+        <w:pStyle w:val="ListBullet"/>
+      </w:pPr>
+      <w:r>
+        <w:t>Row 1: 100, 150, 200, 210</w:t>
+      </w:r>
+    </w:p>
+    <w:p>
+      <w:pPr>
+        <w:pStyle w:val="ListBullet"/>
+      </w:pPr>
+      <w:r>
+        <w:t>Row 2: 100, 160, 210, 210</w:t>
+      </w:r>
+    </w:p>
+    <w:p>
+      <w:pPr>
+        <w:pStyle w:val="ListBullet"/>
+      </w:pPr>
+      <w:r>
+        <w:t>Row 3: 110, 160, 200, 220</w:t>
+      </w:r>
+    </w:p>
+    <w:p>
+      <w:pPr>
+        <w:pStyle w:val="ListBullet"/>
+      </w:pPr>
+      <w:r>
+        <w:t>Row 4: 100, 160, 210, 210</w:t>
+      </w:r>
+    </w:p>
+    <w:p>
+      <w:pPr/>
+      <w:r>
+        <w:t>Kernel (3×3):</w:t>
+      </w:r>
+    </w:p>
+    <w:p>
+      <w:pPr>
+        <w:pStyle w:val="ListBullet"/>
+      </w:pPr>
+      <w:r>
+        <w:t>Row 1: −1, 0, 1</w:t>
+      </w:r>
+    </w:p>
+    <w:p>
+      <w:pPr>
+        <w:pStyle w:val="ListBullet"/>
+      </w:pPr>
+      <w:r>
+        <w:t>Row 2: −1, 0, 1</w:t>
+      </w:r>
+    </w:p>
+    <w:p>
+      <w:pPr>
+        <w:pStyle w:val="ListBullet"/>
+      </w:pPr>
+      <w:r>
+        <w:t>Row 3: −1, 0, 1</w:t>
+      </w:r>
+    </w:p>
+    <w:p>
+      <w:pPr/>
+      <w:r>
+        <w:t>Compute the 2×2 output feature map (no padding, stride = 1). Show every dot-product calculation. (Reference output: top-left = 320, top-right = 170, bottom-left = 160, bottom-right = …).</w:t>
+      </w:r>
+    </w:p>
+    <w:p>
+      <w:pPr>
+        <w:pStyle w:val="Heading4"/>
+      </w:pPr>
+      <w:r>
+        <w:t>Quiz 9 Variant — Convolution with Different Kernel (Aug 2022 paper Q4.2)</w:t>
+      </w:r>
+    </w:p>
+    <w:p>
+      <w:pPr/>
+      <w:r>
+        <w:t>Given a 4×4 input image and the all-ones 3×3 kernel, compute the 2×2 output feature map (stride = 1, no padding). Show working.</w:t>
+      </w:r>
+    </w:p>
+    <w:p>
+      <w:pPr>
+        <w:pStyle w:val="Heading4"/>
+      </w:pPr>
+      <w:r>
+        <w:t>Quiz 9 Variant — Convolution with Edge Kernel (May 2025 paper Q19b)</w:t>
+      </w:r>
+    </w:p>
+    <w:p>
+      <w:pPr/>
+      <w:r>
+        <w:t>Apply the kernel  [[1, 0, −1], [1, 0, −1], [1, 0, −1]]  to the 3×3 image patch  [[4, 3, 2], [1, 0, 1], [−1, −2, −1]]. Compute the single scalar result and explain what feature this kernel detects (vertical edges).</w:t>
+      </w:r>
+    </w:p>
+    <w:p>
+      <w:pPr>
+        <w:pStyle w:val="Heading4"/>
+      </w:pPr>
+      <w:r>
+        <w:t>Quiz 9 Variant — Bayesian Network Inference (recurring across past papers)</w:t>
+      </w:r>
+    </w:p>
+    <w:p>
+      <w:pPr/>
+      <w:r>
+        <w:t>Given a small Bayesian network and the conditional probability tables (CPTs):</w:t>
+      </w:r>
+    </w:p>
+    <w:p>
+      <w:pPr>
+        <w:pStyle w:val="ListBullet"/>
+      </w:pPr>
+      <w:r>
+        <w:t>(a) Compute a marginal probability such as P(C) by summing out hidden variables.</w:t>
+      </w:r>
+    </w:p>
+    <w:p>
+      <w:pPr>
+        <w:pStyle w:val="ListBullet"/>
+      </w:pPr>
+      <w:r>
+        <w:t>(b) Compute a conditional probability such as P(W | C = T) using P(W, C) / P(C).</w:t>
+      </w:r>
+    </w:p>
+    <w:p>
+      <w:pPr>
+        <w:pStyle w:val="ListBullet"/>
+      </w:pPr>
+      <w:r>
+        <w:t>(c) State the conditional independence assumption captured by the network structure.</w:t>
+      </w:r>
+    </w:p>
+    <w:p>
+      <w:pPr>
+        <w:pStyle w:val="Heading4"/>
+      </w:pPr>
+      <w:r>
+        <w:t>Quiz 9 Variant — CNN Concept</w:t>
+      </w:r>
+    </w:p>
+    <w:p>
+      <w:pPr>
+        <w:pStyle w:val="ListBullet"/>
+      </w:pPr>
+      <w:r>
+        <w:t>1. Why do CNNs share weights across spatial positions?</w:t>
+      </w:r>
+    </w:p>
+    <w:p>
+      <w:pPr>
+        <w:pStyle w:val="ListBullet"/>
+      </w:pPr>
+      <w:r>
+        <w:t>2. What is the role of pooling layers, and how does max-pooling differ from average-pooling?</w:t>
+      </w:r>
+    </w:p>
+    <w:p>
+      <w:pPr>
+        <w:pStyle w:val="ListBullet"/>
+      </w:pPr>
+      <w:r>
+        <w:t>3. Compare CNN vs MLP for image classification: parameter count, translation invariance, and inductive bias.</w:t>
       </w:r>
     </w:p>
     <w:p>

</xml_diff>